<commit_message>
Simplify DoD checklist and Safety & Compliance note for management review
- SIGMA used as the only project name throughout both documents
- Plain business English — technical and medical jargon removed or explained
- DoD updated with the latest features: seizure-cohort-only KPIs (7,343
  patients), the 'How the numbers add up' reconciliation line, one-line KPI
  hover descriptions, and card dismissal after approve/queue
- Safety note restructured into three plain-language protection layers:
  patient information, AI guardrails, human in charge
</commit_message>
<xml_diff>
--- a/docs/SIGMA_DoD_Evidence_Checklist.docx
+++ b/docs/SIGMA_DoD_Evidence_Checklist.docx
@@ -40,7 +40,7 @@
           <w:sz w:val="32"/>
           <w:szCs w:val="32"/>
         </w:rPr>
-        <w:t xml:space="preserve">Definition of Done (DoD) — Evidence Checklist</w:t>
+        <w:t xml:space="preserve">Definition of Done — Evidence Checklist</w:t>
       </w:r>
     </w:p>
     <w:p>
@@ -59,7 +59,7 @@
           <w:sz w:val="19"/>
           <w:szCs w:val="19"/>
         </w:rPr>
-        <w:t xml:space="preserve">Use case: Intelligent Patient Journey Analyser &amp; Pharma Strategy Agent   |   Team: CT-Hackcelerate   |   Date: 15 Jul 2026</w:t>
+        <w:t xml:space="preserve">Team: CT-Hackcelerate   |   Date: 15 Jul 2026   |   GitHub: CT-Hackcelerate/SIGMA---Seizure-Intelligence-Growth-Management-Agent</w:t>
       </w:r>
     </w:p>
     <w:p>
@@ -73,7 +73,7 @@
           <w:sz w:val="21"/>
           <w:szCs w:val="21"/>
         </w:rPr>
-        <w:t xml:space="preserve">Definition of Done (DoD) evidence maps every completion criterion of the assigned use case to a concrete, verifiable artifact — a file, a screen, a database record, or a demo step — so reviewers can confirm the work is genuinely done rather than merely claimed. Repository: github.com/CT-Hackcelerate/SIGMA---Seizure-Intelligence-Growth-Management-Agent (main branch). Stack: Python · Streamlit · Plotly · Anthropic Claude API · SQL Server (SSMS, live) · pyodbc. Business identity: our company = EISAI (hero brands Banzel, Fycompa); US seizure &amp; epilepsy cohort incl. Lennox-Gastaut Syndrome — every number in the app is scoped to the seizure cohort only.</w:t>
+        <w:t xml:space="preserve">SIGMA is an AI-powered platform for a pharma company that makes seizure (epilepsy) medicines. It reads the company's live patient database, shows what is happening to seizure patients in plain English, and lets the AI suggest real business actions — which a human approves before anything runs. This checklist lists everything that was required for the project to be called “done”, and for each point, the exact place a reviewer can verify it — a screen in the app, a file in the GitHub repository, or a live demo step.</w:t>
       </w:r>
     </w:p>
     <w:p>
@@ -90,7 +90,7 @@
           <w:sz w:val="25"/>
           <w:szCs w:val="25"/>
         </w:rPr>
-        <w:t xml:space="preserve">1. Core Use Case — Patient Journey Analysis</w:t>
+        <w:t xml:space="preserve">1. Understanding seizure patients (the core of SIGMA)</w:t>
       </w:r>
     </w:p>
     <w:tbl>
@@ -107,9 +107,9 @@
       </w:tblPr>
       <w:tblGrid>
         <w:gridCol w:w="560"/>
-        <w:gridCol w:w="3300"/>
+        <w:gridCol w:w="3600"/>
         <w:gridCol w:w="900"/>
-        <w:gridCol w:w="5320"/>
+        <w:gridCol w:w="5020"/>
       </w:tblGrid>
       <w:tr>
         <w:trPr>
@@ -142,7 +142,7 @@
         </w:tc>
         <w:tc>
           <w:tcPr>
-            <w:tcW w:type="dxa" w:w="3300"/>
+            <w:tcW w:type="dxa" w:w="3600"/>
             <w:shd w:fill="1E3A5F" w:val="clear"/>
             <w:tcMar>
               <w:top w:type="dxa" w:w="60"/>
@@ -161,7 +161,7 @@
                 <w:sz w:val="19"/>
                 <w:szCs w:val="19"/>
               </w:rPr>
-              <w:t xml:space="preserve">Criterion (Definition of Done)</w:t>
+              <w:t xml:space="preserve">What was required (Definition of Done)</w:t>
             </w:r>
           </w:p>
         </w:tc>
@@ -195,7 +195,7 @@
         </w:tc>
         <w:tc>
           <w:tcPr>
-            <w:tcW w:type="dxa" w:w="5320"/>
+            <w:tcW w:type="dxa" w:w="5020"/>
             <w:shd w:fill="1E3A5F" w:val="clear"/>
             <w:tcMar>
               <w:top w:type="dxa" w:w="60"/>
@@ -214,7 +214,7 @@
                 <w:sz w:val="19"/>
                 <w:szCs w:val="19"/>
               </w:rPr>
-              <w:t xml:space="preserve">Evidence — where / how to verify</w:t>
+              <w:t xml:space="preserve">Proof — where a reviewer can see it</w:t>
             </w:r>
           </w:p>
         </w:tc>
@@ -246,25 +246,25 @@
         </w:tc>
         <w:tc>
           <w:tcPr>
-            <w:tcW w:type="dxa" w:w="3300"/>
-            <w:tcMar>
-              <w:top w:type="dxa" w:w="60"/>
-              <w:left w:type="dxa" w:w="90"/>
-              <w:bottom w:type="dxa" w:w="60"/>
-              <w:right w:type="dxa" w:w="90"/>
-            </w:tcMar>
-          </w:tcPr>
-          <w:p>
-            <w:r>
-              <w:rPr>
-                <w:rFonts w:ascii="Calibri" w:cs="Calibri" w:eastAsia="Calibri" w:hAnsi="Calibri"/>
-                <w:b w:val="false"/>
-                <w:bCs w:val="false"/>
-                <w:color w:val="0F172A"/>
-                <w:sz w:val="19"/>
-                <w:szCs w:val="19"/>
-              </w:rPr>
-              <w:t xml:space="preserve">Analyse individual patient journeys end-to-end (symptom → diagnosis → treatment → medicine switches → side effects)</w:t>
+            <w:tcW w:type="dxa" w:w="3600"/>
+            <w:tcMar>
+              <w:top w:type="dxa" w:w="60"/>
+              <w:left w:type="dxa" w:w="90"/>
+              <w:bottom w:type="dxa" w:w="60"/>
+              <w:right w:type="dxa" w:w="90"/>
+            </w:tcMar>
+          </w:tcPr>
+          <w:p>
+            <w:r>
+              <w:rPr>
+                <w:rFonts w:ascii="Calibri" w:cs="Calibri" w:eastAsia="Calibri" w:hAnsi="Calibri"/>
+                <w:b w:val="false"/>
+                <w:bCs w:val="false"/>
+                <w:color w:val="0F172A"/>
+                <w:sz w:val="19"/>
+                <w:szCs w:val="19"/>
+              </w:rPr>
+              <w:t xml:space="preserve">Show one seizure patient's full story — first hospital visit, diagnosis, medicines taken, medicine changes, and side effects — on a single screen</w:t>
             </w:r>
           </w:p>
         </w:tc>
@@ -297,7 +297,7 @@
         </w:tc>
         <w:tc>
           <w:tcPr>
-            <w:tcW w:type="dxa" w:w="5320"/>
+            <w:tcW w:type="dxa" w:w="5020"/>
             <w:tcMar>
               <w:top w:type="dxa" w:w="60"/>
               <w:left w:type="dxa" w:w="90"/>
@@ -315,7 +315,7 @@
                 <w:sz w:val="19"/>
                 <w:szCs w:val="19"/>
               </w:rPr>
-              <w:t xml:space="preserve">Patient Journey Explorer — Timeline Storyteller grid (one row per event type, one square per event, years across the axis); app.py Page 2. Demo with any patient, e.g. #106218944.</w:t>
+              <w:t xml:space="preserve">“Patient Journey Explorer” page: a timeline where every colored square is one real event. Hover any square for the detail. Demo with patient #106218944.</w:t>
             </w:r>
           </w:p>
         </w:tc>
@@ -348,26 +348,26 @@
         </w:tc>
         <w:tc>
           <w:tcPr>
-            <w:tcW w:type="dxa" w:w="3300"/>
-            <w:shd w:fill="EEF2FF" w:val="clear"/>
-            <w:tcMar>
-              <w:top w:type="dxa" w:w="60"/>
-              <w:left w:type="dxa" w:w="90"/>
-              <w:bottom w:type="dxa" w:w="60"/>
-              <w:right w:type="dxa" w:w="90"/>
-            </w:tcMar>
-          </w:tcPr>
-          <w:p>
-            <w:r>
-              <w:rPr>
-                <w:rFonts w:ascii="Calibri" w:cs="Calibri" w:eastAsia="Calibri" w:hAnsi="Calibri"/>
-                <w:b w:val="false"/>
-                <w:bCs w:val="false"/>
-                <w:color w:val="0F172A"/>
-                <w:sz w:val="19"/>
-                <w:szCs w:val="19"/>
-              </w:rPr>
-              <w:t xml:space="preserve">Journey filterable by cohort context (seizure severity, age band) and by date range</w:t>
+            <w:tcW w:type="dxa" w:w="3600"/>
+            <w:shd w:fill="EEF2FF" w:val="clear"/>
+            <w:tcMar>
+              <w:top w:type="dxa" w:w="60"/>
+              <w:left w:type="dxa" w:w="90"/>
+              <w:bottom w:type="dxa" w:w="60"/>
+              <w:right w:type="dxa" w:w="90"/>
+            </w:tcMar>
+          </w:tcPr>
+          <w:p>
+            <w:r>
+              <w:rPr>
+                <w:rFonts w:ascii="Calibri" w:cs="Calibri" w:eastAsia="Calibri" w:hAnsi="Calibri"/>
+                <w:b w:val="false"/>
+                <w:bCs w:val="false"/>
+                <w:color w:val="0F172A"/>
+                <w:sz w:val="19"/>
+                <w:szCs w:val="19"/>
+              </w:rPr>
+              <w:t xml:space="preserve">Let the user narrow that story — by seizure type, age group, and any date window</w:t>
             </w:r>
           </w:p>
         </w:tc>
@@ -401,7 +401,7 @@
         </w:tc>
         <w:tc>
           <w:tcPr>
-            <w:tcW w:type="dxa" w:w="5320"/>
+            <w:tcW w:type="dxa" w:w="5020"/>
             <w:shd w:fill="EEF2FF" w:val="clear"/>
             <w:tcMar>
               <w:top w:type="dxa" w:w="60"/>
@@ -420,7 +420,7 @@
                 <w:sz w:val="19"/>
                 <w:szCs w:val="19"/>
               </w:rPr>
-              <w:t xml:space="preserve">Context &amp; age-group dropdowns + month-granular date range slider directly above the timeline; live matching-patient count banner.</w:t>
+              <w:t xml:space="preserve">Dropdown filters + a date slider directly above the timeline; a live counter shows how many patients match the filters.</w:t>
             </w:r>
           </w:p>
         </w:tc>
@@ -452,25 +452,25 @@
         </w:tc>
         <w:tc>
           <w:tcPr>
-            <w:tcW w:type="dxa" w:w="3300"/>
-            <w:tcMar>
-              <w:top w:type="dxa" w:w="60"/>
-              <w:left w:type="dxa" w:w="90"/>
-              <w:bottom w:type="dxa" w:w="60"/>
-              <w:right w:type="dxa" w:w="90"/>
-            </w:tcMar>
-          </w:tcPr>
-          <w:p>
-            <w:r>
-              <w:rPr>
-                <w:rFonts w:ascii="Calibri" w:cs="Calibri" w:eastAsia="Calibri" w:hAnsi="Calibri"/>
-                <w:b w:val="false"/>
-                <w:bCs w:val="false"/>
-                <w:color w:val="0F172A"/>
-                <w:sz w:val="19"/>
-                <w:szCs w:val="19"/>
-              </w:rPr>
-              <w:t xml:space="preserve">Journey readable by a non-clinical user</w:t>
+            <w:tcW w:type="dxa" w:w="3600"/>
+            <w:tcMar>
+              <w:top w:type="dxa" w:w="60"/>
+              <w:left w:type="dxa" w:w="90"/>
+              <w:bottom w:type="dxa" w:w="60"/>
+              <w:right w:type="dxa" w:w="90"/>
+            </w:tcMar>
+          </w:tcPr>
+          <w:p>
+            <w:r>
+              <w:rPr>
+                <w:rFonts w:ascii="Calibri" w:cs="Calibri" w:eastAsia="Calibri" w:hAnsi="Calibri"/>
+                <w:b w:val="false"/>
+                <w:bCs w:val="false"/>
+                <w:color w:val="0F172A"/>
+                <w:sz w:val="19"/>
+                <w:szCs w:val="19"/>
+              </w:rPr>
+              <w:t xml:space="preserve">Make it readable for people without a medical background</w:t>
             </w:r>
           </w:p>
         </w:tc>
@@ -503,7 +503,7 @@
         </w:tc>
         <w:tc>
           <w:tcPr>
-            <w:tcW w:type="dxa" w:w="5320"/>
+            <w:tcW w:type="dxa" w:w="5020"/>
             <w:tcMar>
               <w:top w:type="dxa" w:w="60"/>
               <w:left w:type="dxa" w:w="90"/>
@@ -521,7 +521,7 @@
                 <w:sz w:val="19"/>
                 <w:szCs w:val="19"/>
               </w:rPr>
-              <w:t xml:space="preserve">Colour-key legend (“What each square means”), “Read this journey as a story” plain-language expander, full event table, captions under every chart.</w:t>
+              <w:t xml:space="preserve">A color legend explains every square; a “Read this journey as a story” section retells it in plain sentences; every chart in the app has a one-line explanation under it.</w:t>
             </w:r>
           </w:p>
         </w:tc>
@@ -554,26 +554,26 @@
         </w:tc>
         <w:tc>
           <w:tcPr>
-            <w:tcW w:type="dxa" w:w="3300"/>
-            <w:shd w:fill="EEF2FF" w:val="clear"/>
-            <w:tcMar>
-              <w:top w:type="dxa" w:w="60"/>
-              <w:left w:type="dxa" w:w="90"/>
-              <w:bottom w:type="dxa" w:w="60"/>
-              <w:right w:type="dxa" w:w="90"/>
-            </w:tcMar>
-          </w:tcPr>
-          <w:p>
-            <w:r>
-              <w:rPr>
-                <w:rFonts w:ascii="Calibri" w:cs="Calibri" w:eastAsia="Calibri" w:hAnsi="Calibri"/>
-                <w:b w:val="false"/>
-                <w:bCs w:val="false"/>
-                <w:color w:val="0F172A"/>
-                <w:sz w:val="19"/>
-                <w:szCs w:val="19"/>
-              </w:rPr>
-              <w:t xml:space="preserve">Population-level journey analytics: diagnosis delay, treatment funnel, drop-off, drug switching</w:t>
+            <w:tcW w:type="dxa" w:w="3600"/>
+            <w:shd w:fill="EEF2FF" w:val="clear"/>
+            <w:tcMar>
+              <w:top w:type="dxa" w:w="60"/>
+              <w:left w:type="dxa" w:w="90"/>
+              <w:bottom w:type="dxa" w:w="60"/>
+              <w:right w:type="dxa" w:w="90"/>
+            </w:tcMar>
+          </w:tcPr>
+          <w:p>
+            <w:r>
+              <w:rPr>
+                <w:rFonts w:ascii="Calibri" w:cs="Calibri" w:eastAsia="Calibri" w:hAnsi="Calibri"/>
+                <w:b w:val="false"/>
+                <w:bCs w:val="false"/>
+                <w:color w:val="0F172A"/>
+                <w:sz w:val="19"/>
+                <w:szCs w:val="19"/>
+              </w:rPr>
+              <w:t xml:space="preserve">Show the big picture too: how long diagnosis takes, how many patients start and stay on medicine, and which medicines they switch to</w:t>
             </w:r>
           </w:p>
         </w:tc>
@@ -607,7 +607,7 @@
         </w:tc>
         <w:tc>
           <w:tcPr>
-            <w:tcW w:type="dxa" w:w="5320"/>
+            <w:tcW w:type="dxa" w:w="5020"/>
             <w:shd w:fill="EEF2FF" w:val="clear"/>
             <w:tcMar>
               <w:top w:type="dxa" w:w="60"/>
@@ -626,7 +626,7 @@
                 <w:sz w:val="19"/>
                 <w:szCs w:val="19"/>
               </w:rPr>
-              <w:t xml:space="preserve">Diagnosis Intelligence page (delay by state, suspects, untreated) and Treatment &amp; Adherence page (funnel Diagnosed→Treated→Adherent from live data, switch reasons, old→new medicine Sankey).</w:t>
+              <w:t xml:space="preserve">“Diagnosis Intelligence” and “Treatment &amp; Adherence” pages — waiting-time by state, the patient funnel (diagnosed → started medicine → still taking it), switch reasons, and a flow chart of old medicine → new medicine.</w:t>
             </w:r>
           </w:p>
         </w:tc>
@@ -646,7 +646,7 @@
           <w:sz w:val="25"/>
           <w:szCs w:val="25"/>
         </w:rPr>
-        <w:t xml:space="preserve">2. Live Data Integration (SQL Server / SSMS)</w:t>
+        <w:t xml:space="preserve">2. Real, live numbers — seizure patients only</w:t>
       </w:r>
     </w:p>
     <w:tbl>
@@ -663,9 +663,9 @@
       </w:tblPr>
       <w:tblGrid>
         <w:gridCol w:w="560"/>
-        <w:gridCol w:w="3300"/>
+        <w:gridCol w:w="3600"/>
         <w:gridCol w:w="900"/>
-        <w:gridCol w:w="5320"/>
+        <w:gridCol w:w="5020"/>
       </w:tblGrid>
       <w:tr>
         <w:trPr>
@@ -698,7 +698,7 @@
         </w:tc>
         <w:tc>
           <w:tcPr>
-            <w:tcW w:type="dxa" w:w="3300"/>
+            <w:tcW w:type="dxa" w:w="3600"/>
             <w:shd w:fill="1E3A5F" w:val="clear"/>
             <w:tcMar>
               <w:top w:type="dxa" w:w="60"/>
@@ -717,7 +717,7 @@
                 <w:sz w:val="19"/>
                 <w:szCs w:val="19"/>
               </w:rPr>
-              <w:t xml:space="preserve">Criterion (Definition of Done)</w:t>
+              <w:t xml:space="preserve">What was required (Definition of Done)</w:t>
             </w:r>
           </w:p>
         </w:tc>
@@ -751,7 +751,7 @@
         </w:tc>
         <w:tc>
           <w:tcPr>
-            <w:tcW w:type="dxa" w:w="5320"/>
+            <w:tcW w:type="dxa" w:w="5020"/>
             <w:shd w:fill="1E3A5F" w:val="clear"/>
             <w:tcMar>
               <w:top w:type="dxa" w:w="60"/>
@@ -770,7 +770,7 @@
                 <w:sz w:val="19"/>
                 <w:szCs w:val="19"/>
               </w:rPr>
-              <w:t xml:space="preserve">Evidence — where / how to verify</w:t>
+              <w:t xml:space="preserve">Proof — where a reviewer can see it</w:t>
             </w:r>
           </w:p>
         </w:tc>
@@ -802,25 +802,25 @@
         </w:tc>
         <w:tc>
           <w:tcPr>
-            <w:tcW w:type="dxa" w:w="3300"/>
-            <w:tcMar>
-              <w:top w:type="dxa" w:w="60"/>
-              <w:left w:type="dxa" w:w="90"/>
-              <w:bottom w:type="dxa" w:w="60"/>
-              <w:right w:type="dxa" w:w="90"/>
-            </w:tcMar>
-          </w:tcPr>
-          <w:p>
-            <w:r>
-              <w:rPr>
-                <w:rFonts w:ascii="Calibri" w:cs="Calibri" w:eastAsia="Calibri" w:hAnsi="Calibri"/>
-                <w:b w:val="false"/>
-                <w:bCs w:val="false"/>
-                <w:color w:val="0F172A"/>
-                <w:sz w:val="19"/>
-                <w:szCs w:val="19"/>
-              </w:rPr>
-              <w:t xml:space="preserve">Runs on the live SSMS database — no hard-coded numbers, no dummy fallback</w:t>
+            <w:tcW w:type="dxa" w:w="3600"/>
+            <w:tcMar>
+              <w:top w:type="dxa" w:w="60"/>
+              <w:left w:type="dxa" w:w="90"/>
+              <w:bottom w:type="dxa" w:w="60"/>
+              <w:right w:type="dxa" w:w="90"/>
+            </w:tcMar>
+          </w:tcPr>
+          <w:p>
+            <w:r>
+              <w:rPr>
+                <w:rFonts w:ascii="Calibri" w:cs="Calibri" w:eastAsia="Calibri" w:hAnsi="Calibri"/>
+                <w:b w:val="false"/>
+                <w:bCs w:val="false"/>
+                <w:color w:val="0F172A"/>
+                <w:sz w:val="19"/>
+                <w:szCs w:val="19"/>
+              </w:rPr>
+              <w:t xml:space="preserve">Every number comes live from the company database — nothing is typed in or faked</w:t>
             </w:r>
           </w:p>
         </w:tc>
@@ -853,7 +853,7 @@
         </w:tc>
         <w:tc>
           <w:tcPr>
-            <w:tcW w:type="dxa" w:w="5320"/>
+            <w:tcW w:type="dxa" w:w="5020"/>
             <w:tcMar>
               <w:top w:type="dxa" w:w="60"/>
               <w:left w:type="dxa" w:w="90"/>
@@ -871,7 +871,7 @@
                 <w:sz w:val="19"/>
                 <w:szCs w:val="19"/>
               </w:rPr>
-              <w:t xml:space="preserve">db.py (SSMS-only access layer). Pre-flight proof: python test_connection.py lists ODBC drivers, connects, enumerates all tables with row counts.</w:t>
+              <w:t xml:space="preserve">All figures are calculated from SQL Server at view time (backend.py). A checker script (test_connection.py) proves the connection and lists the tables.</w:t>
             </w:r>
           </w:p>
         </w:tc>
@@ -904,26 +904,26 @@
         </w:tc>
         <w:tc>
           <w:tcPr>
-            <w:tcW w:type="dxa" w:w="3300"/>
-            <w:shd w:fill="EEF2FF" w:val="clear"/>
-            <w:tcMar>
-              <w:top w:type="dxa" w:w="60"/>
-              <w:left w:type="dxa" w:w="90"/>
-              <w:bottom w:type="dxa" w:w="60"/>
-              <w:right w:type="dxa" w:w="90"/>
-            </w:tcMar>
-          </w:tcPr>
-          <w:p>
-            <w:r>
-              <w:rPr>
-                <w:rFonts w:ascii="Calibri" w:cs="Calibri" w:eastAsia="Calibri" w:hAnsi="Calibri"/>
-                <w:b w:val="false"/>
-                <w:bCs w:val="false"/>
-                <w:color w:val="0F172A"/>
-                <w:sz w:val="19"/>
-                <w:szCs w:val="19"/>
-              </w:rPr>
-              <w:t xml:space="preserve">New rows added in SSMS appear in the app without redeploy</w:t>
+            <w:tcW w:type="dxa" w:w="3600"/>
+            <w:shd w:fill="EEF2FF" w:val="clear"/>
+            <w:tcMar>
+              <w:top w:type="dxa" w:w="60"/>
+              <w:left w:type="dxa" w:w="90"/>
+              <w:bottom w:type="dxa" w:w="60"/>
+              <w:right w:type="dxa" w:w="90"/>
+            </w:tcMar>
+          </w:tcPr>
+          <w:p>
+            <w:r>
+              <w:rPr>
+                <w:rFonts w:ascii="Calibri" w:cs="Calibri" w:eastAsia="Calibri" w:hAnsi="Calibri"/>
+                <w:b w:val="false"/>
+                <w:bCs w:val="false"/>
+                <w:color w:val="0F172A"/>
+                <w:sz w:val="19"/>
+                <w:szCs w:val="19"/>
+              </w:rPr>
+              <w:t xml:space="preserve">New data added to the database shows up in the app without redeploying</w:t>
             </w:r>
           </w:p>
         </w:tc>
@@ -957,7 +957,7 @@
         </w:tc>
         <w:tc>
           <w:tcPr>
-            <w:tcW w:type="dxa" w:w="5320"/>
+            <w:tcW w:type="dxa" w:w="5020"/>
             <w:shd w:fill="EEF2FF" w:val="clear"/>
             <w:tcMar>
               <w:top w:type="dxa" w:w="60"/>
@@ -976,7 +976,7 @@
                 <w:sz w:val="19"/>
                 <w:szCs w:val="19"/>
               </w:rPr>
-              <w:t xml:space="preserve">Sidebar “Refresh Data from SSMS” button; demo by inserting a row in SSMS and refreshing.</w:t>
+              <w:t xml:space="preserve">“Refresh Data” button in the sidebar — add a row in the database, refresh, see it appear.</w:t>
             </w:r>
           </w:p>
         </w:tc>
@@ -1008,25 +1008,25 @@
         </w:tc>
         <w:tc>
           <w:tcPr>
-            <w:tcW w:type="dxa" w:w="3300"/>
-            <w:tcMar>
-              <w:top w:type="dxa" w:w="60"/>
-              <w:left w:type="dxa" w:w="90"/>
-              <w:bottom w:type="dxa" w:w="60"/>
-              <w:right w:type="dxa" w:w="90"/>
-            </w:tcMar>
-          </w:tcPr>
-          <w:p>
-            <w:r>
-              <w:rPr>
-                <w:rFonts w:ascii="Calibri" w:cs="Calibri" w:eastAsia="Calibri" w:hAnsi="Calibri"/>
-                <w:b w:val="false"/>
-                <w:bCs w:val="false"/>
-                <w:color w:val="0F172A"/>
-                <w:sz w:val="19"/>
-                <w:szCs w:val="19"/>
-              </w:rPr>
-              <w:t xml:space="preserve">All 18 source tables consumed correctly (space-containing names bracketed, e.g. [PX  CLM])</w:t>
+            <w:tcW w:type="dxa" w:w="3600"/>
+            <w:tcMar>
+              <w:top w:type="dxa" w:w="60"/>
+              <w:left w:type="dxa" w:w="90"/>
+              <w:bottom w:type="dxa" w:w="60"/>
+              <w:right w:type="dxa" w:w="90"/>
+            </w:tcMar>
+          </w:tcPr>
+          <w:p>
+            <w:r>
+              <w:rPr>
+                <w:rFonts w:ascii="Calibri" w:cs="Calibri" w:eastAsia="Calibri" w:hAnsi="Calibri"/>
+                <w:b w:val="false"/>
+                <w:bCs w:val="false"/>
+                <w:color w:val="0F172A"/>
+                <w:sz w:val="19"/>
+                <w:szCs w:val="19"/>
+              </w:rPr>
+              <w:t xml:space="preserve">Numbers count ONLY seizure &amp; epilepsy patients — never a general population</w:t>
             </w:r>
           </w:p>
         </w:tc>
@@ -1059,7 +1059,7 @@
         </w:tc>
         <w:tc>
           <w:tcPr>
-            <w:tcW w:type="dxa" w:w="5320"/>
+            <w:tcW w:type="dxa" w:w="5020"/>
             <w:tcMar>
               <w:top w:type="dxa" w:w="60"/>
               <w:left w:type="dxa" w:w="90"/>
@@ -1077,7 +1077,112 @@
                 <w:sz w:val="19"/>
                 <w:szCs w:val="19"/>
               </w:rPr>
-              <w:t xml:space="preserve">backend.py parameterised T-SQL; complete schema description in agent.py::_schema_text() used by the AI agent.</w:t>
+              <w:t xml:space="preserve">Executive page header says so; the patient card shows the 7,343 seizure patients (not the raw 10,000 records), and every sales/claims figure counts anti-seizure medicines only.</w:t>
+            </w:r>
+          </w:p>
+        </w:tc>
+      </w:tr>
+      <w:tr>
+        <w:tc>
+          <w:tcPr>
+            <w:tcW w:type="dxa" w:w="560"/>
+            <w:shd w:fill="EEF2FF" w:val="clear"/>
+            <w:tcMar>
+              <w:top w:type="dxa" w:w="60"/>
+              <w:left w:type="dxa" w:w="90"/>
+              <w:bottom w:type="dxa" w:w="60"/>
+              <w:right w:type="dxa" w:w="90"/>
+            </w:tcMar>
+          </w:tcPr>
+          <w:p>
+            <w:r>
+              <w:rPr>
+                <w:rFonts w:ascii="Calibri" w:cs="Calibri" w:eastAsia="Calibri" w:hAnsi="Calibri"/>
+                <w:b/>
+                <w:bCs/>
+                <w:color w:val="0F172A"/>
+                <w:sz w:val="19"/>
+                <w:szCs w:val="19"/>
+              </w:rPr>
+              <w:t xml:space="preserve">2.4</w:t>
+            </w:r>
+          </w:p>
+        </w:tc>
+        <w:tc>
+          <w:tcPr>
+            <w:tcW w:type="dxa" w:w="3600"/>
+            <w:shd w:fill="EEF2FF" w:val="clear"/>
+            <w:tcMar>
+              <w:top w:type="dxa" w:w="60"/>
+              <w:left w:type="dxa" w:w="90"/>
+              <w:bottom w:type="dxa" w:w="60"/>
+              <w:right w:type="dxa" w:w="90"/>
+            </w:tcMar>
+          </w:tcPr>
+          <w:p>
+            <w:r>
+              <w:rPr>
+                <w:rFonts w:ascii="Calibri" w:cs="Calibri" w:eastAsia="Calibri" w:hAnsi="Calibri"/>
+                <w:b w:val="false"/>
+                <w:bCs w:val="false"/>
+                <w:color w:val="0F172A"/>
+                <w:sz w:val="19"/>
+                <w:szCs w:val="19"/>
+              </w:rPr>
+              <w:t xml:space="preserve">The counts must reconcile — a reviewer can check the math</w:t>
+            </w:r>
+          </w:p>
+        </w:tc>
+        <w:tc>
+          <w:tcPr>
+            <w:tcW w:type="dxa" w:w="900"/>
+            <w:shd w:fill="EEF2FF" w:val="clear"/>
+            <w:tcMar>
+              <w:top w:type="dxa" w:w="60"/>
+              <w:left w:type="dxa" w:w="90"/>
+              <w:bottom w:type="dxa" w:w="60"/>
+              <w:right w:type="dxa" w:w="90"/>
+            </w:tcMar>
+          </w:tcPr>
+          <w:p>
+            <w:pPr>
+              <w:jc w:val="center"/>
+            </w:pPr>
+            <w:r>
+              <w:rPr>
+                <w:rFonts w:ascii="Calibri" w:cs="Calibri" w:eastAsia="Calibri" w:hAnsi="Calibri"/>
+                <w:b/>
+                <w:bCs/>
+                <w:color w:val="047857"/>
+                <w:sz w:val="19"/>
+                <w:szCs w:val="19"/>
+              </w:rPr>
+              <w:t xml:space="preserve">DONE</w:t>
+            </w:r>
+          </w:p>
+        </w:tc>
+        <w:tc>
+          <w:tcPr>
+            <w:tcW w:type="dxa" w:w="5020"/>
+            <w:shd w:fill="EEF2FF" w:val="clear"/>
+            <w:tcMar>
+              <w:top w:type="dxa" w:w="60"/>
+              <w:left w:type="dxa" w:w="90"/>
+              <w:bottom w:type="dxa" w:w="60"/>
+              <w:right w:type="dxa" w:w="90"/>
+            </w:tcMar>
+          </w:tcPr>
+          <w:p>
+            <w:r>
+              <w:rPr>
+                <w:rFonts w:ascii="Calibri" w:cs="Calibri" w:eastAsia="Calibri" w:hAnsi="Calibri"/>
+                <w:b w:val="false"/>
+                <w:bCs w:val="false"/>
+                <w:color w:val="475569"/>
+                <w:sz w:val="19"/>
+                <w:szCs w:val="19"/>
+              </w:rPr>
+              <w:t xml:space="preserve">A “How the numbers add up” line under the KPI cards: 7,343 = 6,943 diagnosed + 400 suspected; the diagnosed split into never-treated, active and stopped — calculated live, always consistent.</w:t>
             </w:r>
           </w:p>
         </w:tc>
@@ -1097,7 +1202,7 @@
           <w:sz w:val="25"/>
           <w:szCs w:val="25"/>
         </w:rPr>
-        <w:t xml:space="preserve">3. Agentic AI Capabilities</w:t>
+        <w:t xml:space="preserve">3. The AI agent — suggests first, never acts alone</w:t>
       </w:r>
     </w:p>
     <w:tbl>
@@ -1114,9 +1219,9 @@
       </w:tblPr>
       <w:tblGrid>
         <w:gridCol w:w="560"/>
-        <w:gridCol w:w="3300"/>
+        <w:gridCol w:w="3600"/>
         <w:gridCol w:w="900"/>
-        <w:gridCol w:w="5320"/>
+        <w:gridCol w:w="5020"/>
       </w:tblGrid>
       <w:tr>
         <w:trPr>
@@ -1149,7 +1254,7 @@
         </w:tc>
         <w:tc>
           <w:tcPr>
-            <w:tcW w:type="dxa" w:w="3300"/>
+            <w:tcW w:type="dxa" w:w="3600"/>
             <w:shd w:fill="1E3A5F" w:val="clear"/>
             <w:tcMar>
               <w:top w:type="dxa" w:w="60"/>
@@ -1168,7 +1273,7 @@
                 <w:sz w:val="19"/>
                 <w:szCs w:val="19"/>
               </w:rPr>
-              <w:t xml:space="preserve">Criterion (Definition of Done)</w:t>
+              <w:t xml:space="preserve">What was required (Definition of Done)</w:t>
             </w:r>
           </w:p>
         </w:tc>
@@ -1202,7 +1307,7 @@
         </w:tc>
         <w:tc>
           <w:tcPr>
-            <w:tcW w:type="dxa" w:w="5320"/>
+            <w:tcW w:type="dxa" w:w="5020"/>
             <w:shd w:fill="1E3A5F" w:val="clear"/>
             <w:tcMar>
               <w:top w:type="dxa" w:w="60"/>
@@ -1221,7 +1326,7 @@
                 <w:sz w:val="19"/>
                 <w:szCs w:val="19"/>
               </w:rPr>
-              <w:t xml:space="preserve">Evidence — where / how to verify</w:t>
+              <w:t xml:space="preserve">Proof — where a reviewer can see it</w:t>
             </w:r>
           </w:p>
         </w:tc>
@@ -1253,25 +1358,25 @@
         </w:tc>
         <w:tc>
           <w:tcPr>
-            <w:tcW w:type="dxa" w:w="3300"/>
-            <w:tcMar>
-              <w:top w:type="dxa" w:w="60"/>
-              <w:left w:type="dxa" w:w="90"/>
-              <w:bottom w:type="dxa" w:w="60"/>
-              <w:right w:type="dxa" w:w="90"/>
-            </w:tcMar>
-          </w:tcPr>
-          <w:p>
-            <w:r>
-              <w:rPr>
-                <w:rFonts w:ascii="Calibri" w:cs="Calibri" w:eastAsia="Calibri" w:hAnsi="Calibri"/>
-                <w:b w:val="false"/>
-                <w:bCs w:val="false"/>
-                <w:color w:val="0F172A"/>
-                <w:sz w:val="19"/>
-                <w:szCs w:val="19"/>
-              </w:rPr>
-              <w:t xml:space="preserve">AI generates insights from the live, currently-filtered page data (never canned text)</w:t>
+            <w:tcW w:type="dxa" w:w="3600"/>
+            <w:tcMar>
+              <w:top w:type="dxa" w:w="60"/>
+              <w:left w:type="dxa" w:w="90"/>
+              <w:bottom w:type="dxa" w:w="60"/>
+              <w:right w:type="dxa" w:w="90"/>
+            </w:tcMar>
+          </w:tcPr>
+          <w:p>
+            <w:r>
+              <w:rPr>
+                <w:rFonts w:ascii="Calibri" w:cs="Calibri" w:eastAsia="Calibri" w:hAnsi="Calibri"/>
+                <w:b w:val="false"/>
+                <w:bCs w:val="false"/>
+                <w:color w:val="0F172A"/>
+                <w:sz w:val="19"/>
+                <w:szCs w:val="19"/>
+              </w:rPr>
+              <w:t xml:space="preserve">The AI explains each page's live data in simple business English</w:t>
             </w:r>
           </w:p>
         </w:tc>
@@ -1304,7 +1409,7 @@
         </w:tc>
         <w:tc>
           <w:tcPr>
-            <w:tcW w:type="dxa" w:w="5320"/>
+            <w:tcW w:type="dxa" w:w="5020"/>
             <w:tcMar>
               <w:top w:type="dxa" w:w="60"/>
               <w:left w:type="dxa" w:w="90"/>
@@ -1322,7 +1427,7 @@
                 <w:sz w:val="19"/>
                 <w:szCs w:val="19"/>
               </w:rPr>
-              <w:t xml:space="preserve">ai_engine.py::generate_page_insight() — Claude structured JSON output; “✨ Generate” panel on every page; active filters passed into the AI context.</w:t>
+              <w:t xml:space="preserve">“Generate” button on every page → a short executive summary with real numbers, risks, and the money at stake.</w:t>
             </w:r>
           </w:p>
         </w:tc>
@@ -1355,26 +1460,26 @@
         </w:tc>
         <w:tc>
           <w:tcPr>
-            <w:tcW w:type="dxa" w:w="3300"/>
-            <w:shd w:fill="EEF2FF" w:val="clear"/>
-            <w:tcMar>
-              <w:top w:type="dxa" w:w="60"/>
-              <w:left w:type="dxa" w:w="90"/>
-              <w:bottom w:type="dxa" w:w="60"/>
-              <w:right w:type="dxa" w:w="90"/>
-            </w:tcMar>
-          </w:tcPr>
-          <w:p>
-            <w:r>
-              <w:rPr>
-                <w:rFonts w:ascii="Calibri" w:cs="Calibri" w:eastAsia="Calibri" w:hAnsi="Calibri"/>
-                <w:b w:val="false"/>
-                <w:bCs w:val="false"/>
-                <w:color w:val="0F172A"/>
-                <w:sz w:val="19"/>
-                <w:szCs w:val="19"/>
-              </w:rPr>
-              <w:t xml:space="preserve">Agent writes and runs its own SQL (tool use), answers with real numbers</w:t>
+            <w:tcW w:type="dxa" w:w="3600"/>
+            <w:shd w:fill="EEF2FF" w:val="clear"/>
+            <w:tcMar>
+              <w:top w:type="dxa" w:w="60"/>
+              <w:left w:type="dxa" w:w="90"/>
+              <w:bottom w:type="dxa" w:w="60"/>
+              <w:right w:type="dxa" w:w="90"/>
+            </w:tcMar>
+          </w:tcPr>
+          <w:p>
+            <w:r>
+              <w:rPr>
+                <w:rFonts w:ascii="Calibri" w:cs="Calibri" w:eastAsia="Calibri" w:hAnsi="Calibri"/>
+                <w:b w:val="false"/>
+                <w:bCs w:val="false"/>
+                <w:color w:val="0F172A"/>
+                <w:sz w:val="19"/>
+                <w:szCs w:val="19"/>
+              </w:rPr>
+              <w:t xml:space="preserve">The AI answers free-typed questions by querying the database itself — and shows its work</w:t>
             </w:r>
           </w:p>
         </w:tc>
@@ -1408,7 +1513,7 @@
         </w:tc>
         <w:tc>
           <w:tcPr>
-            <w:tcW w:type="dxa" w:w="5320"/>
+            <w:tcW w:type="dxa" w:w="5020"/>
             <w:shd w:fill="EEF2FF" w:val="clear"/>
             <w:tcMar>
               <w:top w:type="dxa" w:w="60"/>
@@ -1427,7 +1532,7 @@
                 <w:sz w:val="19"/>
                 <w:szCs w:val="19"/>
               </w:rPr>
-              <w:t xml:space="preserve">agent.py query_database tool; AI Strategy Agent chat shows the executed SQL in a code block under each answer.</w:t>
+              <w:t xml:space="preserve">“AI Strategy Agent” chat page: ask anything (e.g. “which insurer refuses the most claims?”); the answer includes the exact database query it ran, for full transparency.</w:t>
             </w:r>
           </w:p>
         </w:tc>
@@ -1459,25 +1564,25 @@
         </w:tc>
         <w:tc>
           <w:tcPr>
-            <w:tcW w:type="dxa" w:w="3300"/>
-            <w:tcMar>
-              <w:top w:type="dxa" w:w="60"/>
-              <w:left w:type="dxa" w:w="90"/>
-              <w:bottom w:type="dxa" w:w="60"/>
-              <w:right w:type="dxa" w:w="90"/>
-            </w:tcMar>
-          </w:tcPr>
-          <w:p>
-            <w:r>
-              <w:rPr>
-                <w:rFonts w:ascii="Calibri" w:cs="Calibri" w:eastAsia="Calibri" w:hAnsi="Calibri"/>
-                <w:b w:val="false"/>
-                <w:bCs w:val="false"/>
-                <w:color w:val="0F172A"/>
-                <w:sz w:val="19"/>
-                <w:szCs w:val="19"/>
-              </w:rPr>
-              <w:t xml:space="preserve">Agent proposes executable actions — patient-level and business-level, with alternatives</w:t>
+            <w:tcW w:type="dxa" w:w="3600"/>
+            <w:tcMar>
+              <w:top w:type="dxa" w:w="60"/>
+              <w:left w:type="dxa" w:w="90"/>
+              <w:bottom w:type="dxa" w:w="60"/>
+              <w:right w:type="dxa" w:w="90"/>
+            </w:tcMar>
+          </w:tcPr>
+          <w:p>
+            <w:r>
+              <w:rPr>
+                <w:rFonts w:ascii="Calibri" w:cs="Calibri" w:eastAsia="Calibri" w:hAnsi="Calibri"/>
+                <w:b w:val="false"/>
+                <w:bCs w:val="false"/>
+                <w:color w:val="0F172A"/>
+                <w:sz w:val="19"/>
+                <w:szCs w:val="19"/>
+              </w:rPr>
+              <w:t xml:space="preserve">Every finding comes with 2–3 alternative actions so the business decides, not the AI</w:t>
             </w:r>
           </w:p>
         </w:tc>
@@ -1510,7 +1615,7 @@
         </w:tc>
         <w:tc>
           <w:tcPr>
-            <w:tcW w:type="dxa" w:w="5320"/>
+            <w:tcW w:type="dxa" w:w="5020"/>
             <w:tcMar>
               <w:top w:type="dxa" w:w="60"/>
               <w:left w:type="dxa" w:w="90"/>
@@ -1528,7 +1633,7 @@
                 <w:sz w:val="19"/>
                 <w:szCs w:val="19"/>
               </w:rPr>
-              <w:t xml:space="preserve">Opportunity cards: each finding carries 2–3 genuinely different options (effort/cost/timeframe/confidence/$ value); propose_action &amp; propose_business_action tools.</w:t>
+              <w:t xml:space="preserve">Opportunity cards: each shows the options side by side with effort, cost, timeframe and estimated value.</w:t>
             </w:r>
           </w:p>
         </w:tc>
@@ -1561,26 +1666,26 @@
         </w:tc>
         <w:tc>
           <w:tcPr>
-            <w:tcW w:type="dxa" w:w="3300"/>
-            <w:shd w:fill="EEF2FF" w:val="clear"/>
-            <w:tcMar>
-              <w:top w:type="dxa" w:w="60"/>
-              <w:left w:type="dxa" w:w="90"/>
-              <w:bottom w:type="dxa" w:w="60"/>
-              <w:right w:type="dxa" w:w="90"/>
-            </w:tcMar>
-          </w:tcPr>
-          <w:p>
-            <w:r>
-              <w:rPr>
-                <w:rFonts w:ascii="Calibri" w:cs="Calibri" w:eastAsia="Calibri" w:hAnsi="Calibri"/>
-                <w:b w:val="false"/>
-                <w:bCs w:val="false"/>
-                <w:color w:val="0F172A"/>
-                <w:sz w:val="19"/>
-                <w:szCs w:val="19"/>
-              </w:rPr>
-              <w:t xml:space="preserve">Human-in-the-loop: no action executes without approval</w:t>
+            <w:tcW w:type="dxa" w:w="3600"/>
+            <w:shd w:fill="EEF2FF" w:val="clear"/>
+            <w:tcMar>
+              <w:top w:type="dxa" w:w="60"/>
+              <w:left w:type="dxa" w:w="90"/>
+              <w:bottom w:type="dxa" w:w="60"/>
+              <w:right w:type="dxa" w:w="90"/>
+            </w:tcMar>
+          </w:tcPr>
+          <w:p>
+            <w:r>
+              <w:rPr>
+                <w:rFonts w:ascii="Calibri" w:cs="Calibri" w:eastAsia="Calibri" w:hAnsi="Calibri"/>
+                <w:b w:val="false"/>
+                <w:bCs w:val="false"/>
+                <w:color w:val="0F172A"/>
+                <w:sz w:val="19"/>
+                <w:szCs w:val="19"/>
+              </w:rPr>
+              <w:t xml:space="preserve">Nothing happens without human approval</w:t>
             </w:r>
           </w:p>
         </w:tc>
@@ -1614,7 +1719,7 @@
         </w:tc>
         <w:tc>
           <w:tcPr>
-            <w:tcW w:type="dxa" w:w="5320"/>
+            <w:tcW w:type="dxa" w:w="5020"/>
             <w:shd w:fill="EEF2FF" w:val="clear"/>
             <w:tcMar>
               <w:top w:type="dxa" w:w="60"/>
@@ -1633,7 +1738,7 @@
                 <w:sz w:val="19"/>
                 <w:szCs w:val="19"/>
               </w:rPr>
-              <w:t xml:space="preserve">Action Center approval queue (Agent_Pending_Actions / Agent_Business_Actions); actions.py propose → approve → execute flow.</w:t>
+              <w:t xml:space="preserve">Every suggested action goes to an approval queue in the “Action Center”; only clicking Approve makes it run. Approved/queued items disappear from the page so nothing is actioned twice.</w:t>
             </w:r>
           </w:p>
         </w:tc>
@@ -1665,25 +1770,25 @@
         </w:tc>
         <w:tc>
           <w:tcPr>
-            <w:tcW w:type="dxa" w:w="3300"/>
-            <w:tcMar>
-              <w:top w:type="dxa" w:w="60"/>
-              <w:left w:type="dxa" w:w="90"/>
-              <w:bottom w:type="dxa" w:w="60"/>
-              <w:right w:type="dxa" w:w="90"/>
-            </w:tcMar>
-          </w:tcPr>
-          <w:p>
-            <w:r>
-              <w:rPr>
-                <w:rFonts w:ascii="Calibri" w:cs="Calibri" w:eastAsia="Calibri" w:hAnsi="Calibri"/>
-                <w:b w:val="false"/>
-                <w:bCs w:val="false"/>
-                <w:color w:val="0F172A"/>
-                <w:sz w:val="19"/>
-                <w:szCs w:val="19"/>
-              </w:rPr>
-              <w:t xml:space="preserve">Governed autonomy (risk-tiered auto-execution)</w:t>
+            <w:tcW w:type="dxa" w:w="3600"/>
+            <w:tcMar>
+              <w:top w:type="dxa" w:w="60"/>
+              <w:left w:type="dxa" w:w="90"/>
+              <w:bottom w:type="dxa" w:w="60"/>
+              <w:right w:type="dxa" w:w="90"/>
+            </w:tcMar>
+          </w:tcPr>
+          <w:p>
+            <w:r>
+              <w:rPr>
+                <w:rFonts w:ascii="Calibri" w:cs="Calibri" w:eastAsia="Calibri" w:hAnsi="Calibri"/>
+                <w:b w:val="false"/>
+                <w:bCs w:val="false"/>
+                <w:color w:val="0F172A"/>
+                <w:sz w:val="19"/>
+                <w:szCs w:val="19"/>
+              </w:rPr>
+              <w:t xml:space="preserve">Small, safe tasks may run automatically; anything risky always waits for a person</w:t>
             </w:r>
           </w:p>
         </w:tc>
@@ -1716,7 +1821,7 @@
         </w:tc>
         <w:tc>
           <w:tcPr>
-            <w:tcW w:type="dxa" w:w="5320"/>
+            <w:tcW w:type="dxa" w:w="5020"/>
             <w:tcMar>
               <w:top w:type="dxa" w:w="60"/>
               <w:left w:type="dxa" w:w="90"/>
@@ -1734,7 +1839,7 @@
                 <w:sz w:val="19"/>
                 <w:szCs w:val="19"/>
               </w:rPr>
-              <w:t xml:space="preserve">agent_watchdog.py sweep on every start; actions.py RISK_TIERS — low-risk actions auto-execute as “Autopilot” when Autonomous Mode is ON; high-risk (tests, prescriptions, referrals, budget) always wait for a human.</w:t>
+              <w:t xml:space="preserve">“Autonomous Mode” switch in the sidebar. The safe list (reminders, appointments, claim follow-ups) is fixed in code — medicine changes, tests, referrals and budget moves ALWAYS need approval.</w:t>
             </w:r>
           </w:p>
         </w:tc>
@@ -1767,26 +1872,26 @@
         </w:tc>
         <w:tc>
           <w:tcPr>
-            <w:tcW w:type="dxa" w:w="3300"/>
-            <w:shd w:fill="EEF2FF" w:val="clear"/>
-            <w:tcMar>
-              <w:top w:type="dxa" w:w="60"/>
-              <w:left w:type="dxa" w:w="90"/>
-              <w:bottom w:type="dxa" w:w="60"/>
-              <w:right w:type="dxa" w:w="90"/>
-            </w:tcMar>
-          </w:tcPr>
-          <w:p>
-            <w:r>
-              <w:rPr>
-                <w:rFonts w:ascii="Calibri" w:cs="Calibri" w:eastAsia="Calibri" w:hAnsi="Calibri"/>
-                <w:b w:val="false"/>
-                <w:bCs w:val="false"/>
-                <w:color w:val="0F172A"/>
-                <w:sz w:val="19"/>
-                <w:szCs w:val="19"/>
-              </w:rPr>
-              <w:t xml:space="preserve">Agent learns from business rejections</w:t>
+            <w:tcW w:type="dxa" w:w="3600"/>
+            <w:shd w:fill="EEF2FF" w:val="clear"/>
+            <w:tcMar>
+              <w:top w:type="dxa" w:w="60"/>
+              <w:left w:type="dxa" w:w="90"/>
+              <w:bottom w:type="dxa" w:w="60"/>
+              <w:right w:type="dxa" w:w="90"/>
+            </w:tcMar>
+          </w:tcPr>
+          <w:p>
+            <w:r>
+              <w:rPr>
+                <w:rFonts w:ascii="Calibri" w:cs="Calibri" w:eastAsia="Calibri" w:hAnsi="Calibri"/>
+                <w:b w:val="false"/>
+                <w:bCs w:val="false"/>
+                <w:color w:val="0F172A"/>
+                <w:sz w:val="19"/>
+                <w:szCs w:val="19"/>
+              </w:rPr>
+              <w:t xml:space="preserve">The AI respects a “no” — rejected ideas are not repeated</w:t>
             </w:r>
           </w:p>
         </w:tc>
@@ -1820,7 +1925,7 @@
         </w:tc>
         <w:tc>
           <w:tcPr>
-            <w:tcW w:type="dxa" w:w="5320"/>
+            <w:tcW w:type="dxa" w:w="5020"/>
             <w:shd w:fill="EEF2FF" w:val="clear"/>
             <w:tcMar>
               <w:top w:type="dxa" w:w="60"/>
@@ -1839,7 +1944,7 @@
                 <w:sz w:val="19"/>
                 <w:szCs w:val="19"/>
               </w:rPr>
-              <w:t xml:space="preserve">Rejected actions are not re-proposed for 30 days (hard guard) and recent rejections are injected into every insight/chat prompt (actions.py::get_recent_rejections).</w:t>
+              <w:t xml:space="preserve">A rejected action is blocked for 30 days and the AI is told about recent rejections so it proposes a different approach.</w:t>
             </w:r>
           </w:p>
         </w:tc>
@@ -1871,25 +1976,25 @@
         </w:tc>
         <w:tc>
           <w:tcPr>
-            <w:tcW w:type="dxa" w:w="3300"/>
-            <w:tcMar>
-              <w:top w:type="dxa" w:w="60"/>
-              <w:left w:type="dxa" w:w="90"/>
-              <w:bottom w:type="dxa" w:w="60"/>
-              <w:right w:type="dxa" w:w="90"/>
-            </w:tcMar>
-          </w:tcPr>
-          <w:p>
-            <w:r>
-              <w:rPr>
-                <w:rFonts w:ascii="Calibri" w:cs="Calibri" w:eastAsia="Calibri" w:hAnsi="Calibri"/>
-                <w:b w:val="false"/>
-                <w:bCs w:val="false"/>
-                <w:color w:val="0F172A"/>
-                <w:sz w:val="19"/>
-                <w:szCs w:val="19"/>
-              </w:rPr>
-              <w:t xml:space="preserve">Unattended scheduled operation</w:t>
+            <w:tcW w:type="dxa" w:w="3600"/>
+            <w:tcMar>
+              <w:top w:type="dxa" w:w="60"/>
+              <w:left w:type="dxa" w:w="90"/>
+              <w:bottom w:type="dxa" w:w="60"/>
+              <w:right w:type="dxa" w:w="90"/>
+            </w:tcMar>
+          </w:tcPr>
+          <w:p>
+            <w:r>
+              <w:rPr>
+                <w:rFonts w:ascii="Calibri" w:cs="Calibri" w:eastAsia="Calibri" w:hAnsi="Calibri"/>
+                <w:b w:val="false"/>
+                <w:bCs w:val="false"/>
+                <w:color w:val="0F172A"/>
+                <w:sz w:val="19"/>
+                <w:szCs w:val="19"/>
+              </w:rPr>
+              <w:t xml:space="preserve">SIGMA can work unattended on a schedule</w:t>
             </w:r>
           </w:p>
         </w:tc>
@@ -1922,7 +2027,7 @@
         </w:tc>
         <w:tc>
           <w:tcPr>
-            <w:tcW w:type="dxa" w:w="5320"/>
+            <w:tcW w:type="dxa" w:w="5020"/>
             <w:tcMar>
               <w:top w:type="dxa" w:w="60"/>
               <w:left w:type="dxa" w:w="90"/>
@@ -1940,7 +2045,7 @@
                 <w:sz w:val="19"/>
                 <w:szCs w:val="19"/>
               </w:rPr>
-              <w:t xml:space="preserve">python scheduler.py --once (single cycle) or daily 08:00 mode — watchdog sweep + Claude deep scan fill the approval queue; console report printed.</w:t>
+              <w:t xml:space="preserve">One command (scheduler.py) runs a daily scan that finds risks and opportunities overnight and fills the approval queue for the morning.</w:t>
             </w:r>
           </w:p>
         </w:tc>
@@ -1960,7 +2065,7 @@
           <w:sz w:val="25"/>
           <w:szCs w:val="25"/>
         </w:rPr>
-        <w:t xml:space="preserve">4. Action Execution &amp; Auditability</w:t>
+        <w:t xml:space="preserve">4. Actions really happen — and everything is on record</w:t>
       </w:r>
     </w:p>
     <w:tbl>
@@ -1977,9 +2082,9 @@
       </w:tblPr>
       <w:tblGrid>
         <w:gridCol w:w="560"/>
-        <w:gridCol w:w="3300"/>
+        <w:gridCol w:w="3600"/>
         <w:gridCol w:w="900"/>
-        <w:gridCol w:w="5320"/>
+        <w:gridCol w:w="5020"/>
       </w:tblGrid>
       <w:tr>
         <w:trPr>
@@ -2012,7 +2117,7 @@
         </w:tc>
         <w:tc>
           <w:tcPr>
-            <w:tcW w:type="dxa" w:w="3300"/>
+            <w:tcW w:type="dxa" w:w="3600"/>
             <w:shd w:fill="1E3A5F" w:val="clear"/>
             <w:tcMar>
               <w:top w:type="dxa" w:w="60"/>
@@ -2031,7 +2136,7 @@
                 <w:sz w:val="19"/>
                 <w:szCs w:val="19"/>
               </w:rPr>
-              <w:t xml:space="preserve">Criterion (Definition of Done)</w:t>
+              <w:t xml:space="preserve">What was required (Definition of Done)</w:t>
             </w:r>
           </w:p>
         </w:tc>
@@ -2065,7 +2170,7 @@
         </w:tc>
         <w:tc>
           <w:tcPr>
-            <w:tcW w:type="dxa" w:w="5320"/>
+            <w:tcW w:type="dxa" w:w="5020"/>
             <w:shd w:fill="1E3A5F" w:val="clear"/>
             <w:tcMar>
               <w:top w:type="dxa" w:w="60"/>
@@ -2084,7 +2189,7 @@
                 <w:sz w:val="19"/>
                 <w:szCs w:val="19"/>
               </w:rPr>
-              <w:t xml:space="preserve">Evidence — where / how to verify</w:t>
+              <w:t xml:space="preserve">Proof — where a reviewer can see it</w:t>
             </w:r>
           </w:p>
         </w:tc>
@@ -2116,25 +2221,25 @@
         </w:tc>
         <w:tc>
           <w:tcPr>
-            <w:tcW w:type="dxa" w:w="3300"/>
-            <w:tcMar>
-              <w:top w:type="dxa" w:w="60"/>
-              <w:left w:type="dxa" w:w="90"/>
-              <w:bottom w:type="dxa" w:w="60"/>
-              <w:right w:type="dxa" w:w="90"/>
-            </w:tcMar>
-          </w:tcPr>
-          <w:p>
-            <w:r>
-              <w:rPr>
-                <w:rFonts w:ascii="Calibri" w:cs="Calibri" w:eastAsia="Calibri" w:hAnsi="Calibri"/>
-                <w:b w:val="false"/>
-                <w:bCs w:val="false"/>
-                <w:color w:val="0F172A"/>
-                <w:sz w:val="19"/>
-                <w:szCs w:val="19"/>
-              </w:rPr>
-              <w:t xml:space="preserve">Approved actions create real records</w:t>
+            <w:tcW w:type="dxa" w:w="3600"/>
+            <w:tcMar>
+              <w:top w:type="dxa" w:w="60"/>
+              <w:left w:type="dxa" w:w="90"/>
+              <w:bottom w:type="dxa" w:w="60"/>
+              <w:right w:type="dxa" w:w="90"/>
+            </w:tcMar>
+          </w:tcPr>
+          <w:p>
+            <w:r>
+              <w:rPr>
+                <w:rFonts w:ascii="Calibri" w:cs="Calibri" w:eastAsia="Calibri" w:hAnsi="Calibri"/>
+                <w:b w:val="false"/>
+                <w:bCs w:val="false"/>
+                <w:color w:val="0F172A"/>
+                <w:sz w:val="19"/>
+                <w:szCs w:val="19"/>
+              </w:rPr>
+              <w:t xml:space="preserve">An approved action creates a real record, not just a message on screen</w:t>
             </w:r>
           </w:p>
         </w:tc>
@@ -2167,7 +2272,7 @@
         </w:tc>
         <w:tc>
           <w:tcPr>
-            <w:tcW w:type="dxa" w:w="5320"/>
+            <w:tcW w:type="dxa" w:w="5020"/>
             <w:tcMar>
               <w:top w:type="dxa" w:w="60"/>
               <w:left w:type="dxa" w:w="90"/>
@@ -2185,7 +2290,7 @@
                 <w:sz w:val="19"/>
                 <w:szCs w:val="19"/>
               </w:rPr>
-              <w:t xml:space="preserve">Rows visible in SSMS: Agent_Appointments, Agent_Notifications (simulated e-mail unless SMTP configured); demo an approval and show the new row.</w:t>
+              <w:t xml:space="preserve">Approve an action, then open the Appointments / Notifications tabs — the new record is there, stored in the database.</w:t>
             </w:r>
           </w:p>
         </w:tc>
@@ -2218,26 +2323,26 @@
         </w:tc>
         <w:tc>
           <w:tcPr>
-            <w:tcW w:type="dxa" w:w="3300"/>
-            <w:shd w:fill="EEF2FF" w:val="clear"/>
-            <w:tcMar>
-              <w:top w:type="dxa" w:w="60"/>
-              <w:left w:type="dxa" w:w="90"/>
-              <w:bottom w:type="dxa" w:w="60"/>
-              <w:right w:type="dxa" w:w="90"/>
-            </w:tcMar>
-          </w:tcPr>
-          <w:p>
-            <w:r>
-              <w:rPr>
-                <w:rFonts w:ascii="Calibri" w:cs="Calibri" w:eastAsia="Calibri" w:hAnsi="Calibri"/>
-                <w:b w:val="false"/>
-                <w:bCs w:val="false"/>
-                <w:color w:val="0F172A"/>
-                <w:sz w:val="19"/>
-                <w:szCs w:val="19"/>
-              </w:rPr>
-              <w:t xml:space="preserve">Complete audit trail with consistent timestamps</w:t>
+            <w:tcW w:type="dxa" w:w="3600"/>
+            <w:shd w:fill="EEF2FF" w:val="clear"/>
+            <w:tcMar>
+              <w:top w:type="dxa" w:w="60"/>
+              <w:left w:type="dxa" w:w="90"/>
+              <w:bottom w:type="dxa" w:w="60"/>
+              <w:right w:type="dxa" w:w="90"/>
+            </w:tcMar>
+          </w:tcPr>
+          <w:p>
+            <w:r>
+              <w:rPr>
+                <w:rFonts w:ascii="Calibri" w:cs="Calibri" w:eastAsia="Calibri" w:hAnsi="Calibri"/>
+                <w:b w:val="false"/>
+                <w:bCs w:val="false"/>
+                <w:color w:val="0F172A"/>
+                <w:sz w:val="19"/>
+                <w:szCs w:val="19"/>
+              </w:rPr>
+              <w:t xml:space="preserve">A complete activity log: who did what and when</w:t>
             </w:r>
           </w:p>
         </w:tc>
@@ -2271,7 +2376,7 @@
         </w:tc>
         <w:tc>
           <w:tcPr>
-            <w:tcW w:type="dxa" w:w="5320"/>
+            <w:tcW w:type="dxa" w:w="5020"/>
             <w:shd w:fill="EEF2FF" w:val="clear"/>
             <w:tcMar>
               <w:top w:type="dxa" w:w="60"/>
@@ -2290,7 +2395,7 @@
                 <w:sz w:val="19"/>
                 <w:szCs w:val="19"/>
               </w:rPr>
-              <w:t xml:space="preserve">Audit Log tab in Action Center; every timestamp written as SYSUTCDATETIME() and displayed with “(UTC)” column labels and a UTC banner.</w:t>
+              <w:t xml:space="preserve">“Audit Log” tab records every suggestion, approval, rejection and execution — by the human or by the AI — with all times in one world-standard clock (UTC), labeled on every column.</w:t>
             </w:r>
           </w:p>
         </w:tc>
@@ -2322,25 +2427,25 @@
         </w:tc>
         <w:tc>
           <w:tcPr>
-            <w:tcW w:type="dxa" w:w="3300"/>
-            <w:tcMar>
-              <w:top w:type="dxa" w:w="60"/>
-              <w:left w:type="dxa" w:w="90"/>
-              <w:bottom w:type="dxa" w:w="60"/>
-              <w:right w:type="dxa" w:w="90"/>
-            </w:tcMar>
-          </w:tcPr>
-          <w:p>
-            <w:r>
-              <w:rPr>
-                <w:rFonts w:ascii="Calibri" w:cs="Calibri" w:eastAsia="Calibri" w:hAnsi="Calibri"/>
-                <w:b w:val="false"/>
-                <w:bCs w:val="false"/>
-                <w:color w:val="0F172A"/>
-                <w:sz w:val="19"/>
-                <w:szCs w:val="19"/>
-              </w:rPr>
-              <w:t xml:space="preserve">Value/ROI tracking of agent activity</w:t>
+            <w:tcW w:type="dxa" w:w="3600"/>
+            <w:tcMar>
+              <w:top w:type="dxa" w:w="60"/>
+              <w:left w:type="dxa" w:w="90"/>
+              <w:bottom w:type="dxa" w:w="60"/>
+              <w:right w:type="dxa" w:w="90"/>
+            </w:tcMar>
+          </w:tcPr>
+          <w:p>
+            <w:r>
+              <w:rPr>
+                <w:rFonts w:ascii="Calibri" w:cs="Calibri" w:eastAsia="Calibri" w:hAnsi="Calibri"/>
+                <w:b w:val="false"/>
+                <w:bCs w:val="false"/>
+                <w:color w:val="0F172A"/>
+                <w:sz w:val="19"/>
+                <w:szCs w:val="19"/>
+              </w:rPr>
+              <w:t xml:space="preserve">The value of the AI's work is measured in money</w:t>
             </w:r>
           </w:p>
         </w:tc>
@@ -2373,7 +2478,7 @@
         </w:tc>
         <w:tc>
           <w:tcPr>
-            <w:tcW w:type="dxa" w:w="5320"/>
+            <w:tcW w:type="dxa" w:w="5020"/>
             <w:tcMar>
               <w:top w:type="dxa" w:w="60"/>
               <w:left w:type="dxa" w:w="90"/>
@@ -2391,7 +2496,7 @@
                 <w:sz w:val="19"/>
                 <w:szCs w:val="19"/>
               </w:rPr>
-              <w:t xml:space="preserve">Action Center KPI row: Value Captured, Value Pending, Actions Executed (incl. Autopilot count), Approval Rate, Patient Touchpoints.</w:t>
+              <w:t xml:space="preserve">Action Center scoreboard: Value Captured, Value Pending, actions executed, and the approval rate.</w:t>
             </w:r>
           </w:p>
         </w:tc>
@@ -2411,7 +2516,7 @@
           <w:sz w:val="25"/>
           <w:szCs w:val="25"/>
         </w:rPr>
-        <w:t xml:space="preserve">5. Privacy &amp; Safety</w:t>
+        <w:t xml:space="preserve">5. Privacy &amp; safety</w:t>
       </w:r>
     </w:p>
     <w:tbl>
@@ -2428,9 +2533,9 @@
       </w:tblPr>
       <w:tblGrid>
         <w:gridCol w:w="560"/>
-        <w:gridCol w:w="3300"/>
+        <w:gridCol w:w="3600"/>
         <w:gridCol w:w="900"/>
-        <w:gridCol w:w="5320"/>
+        <w:gridCol w:w="5020"/>
       </w:tblGrid>
       <w:tr>
         <w:trPr>
@@ -2463,7 +2568,7 @@
         </w:tc>
         <w:tc>
           <w:tcPr>
-            <w:tcW w:type="dxa" w:w="3300"/>
+            <w:tcW w:type="dxa" w:w="3600"/>
             <w:shd w:fill="1E3A5F" w:val="clear"/>
             <w:tcMar>
               <w:top w:type="dxa" w:w="60"/>
@@ -2482,7 +2587,7 @@
                 <w:sz w:val="19"/>
                 <w:szCs w:val="19"/>
               </w:rPr>
-              <w:t xml:space="preserve">Criterion (Definition of Done)</w:t>
+              <w:t xml:space="preserve">What was required (Definition of Done)</w:t>
             </w:r>
           </w:p>
         </w:tc>
@@ -2516,7 +2621,7 @@
         </w:tc>
         <w:tc>
           <w:tcPr>
-            <w:tcW w:type="dxa" w:w="5320"/>
+            <w:tcW w:type="dxa" w:w="5020"/>
             <w:shd w:fill="1E3A5F" w:val="clear"/>
             <w:tcMar>
               <w:top w:type="dxa" w:w="60"/>
@@ -2535,7 +2640,7 @@
                 <w:sz w:val="19"/>
                 <w:szCs w:val="19"/>
               </w:rPr>
-              <w:t xml:space="preserve">Evidence — where / how to verify</w:t>
+              <w:t xml:space="preserve">Proof — where a reviewer can see it</w:t>
             </w:r>
           </w:p>
         </w:tc>
@@ -2567,25 +2672,25 @@
         </w:tc>
         <w:tc>
           <w:tcPr>
-            <w:tcW w:type="dxa" w:w="3300"/>
-            <w:tcMar>
-              <w:top w:type="dxa" w:w="60"/>
-              <w:left w:type="dxa" w:w="90"/>
-              <w:bottom w:type="dxa" w:w="60"/>
-              <w:right w:type="dxa" w:w="90"/>
-            </w:tcMar>
-          </w:tcPr>
-          <w:p>
-            <w:r>
-              <w:rPr>
-                <w:rFonts w:ascii="Calibri" w:cs="Calibri" w:eastAsia="Calibri" w:hAnsi="Calibri"/>
-                <w:b w:val="false"/>
-                <w:bCs w:val="false"/>
-                <w:color w:val="0F172A"/>
-                <w:sz w:val="19"/>
-                <w:szCs w:val="19"/>
-              </w:rPr>
-              <w:t xml:space="preserve">Patients identified by ID only — no names anywhere</w:t>
+            <w:tcW w:type="dxa" w:w="3600"/>
+            <w:tcMar>
+              <w:top w:type="dxa" w:w="60"/>
+              <w:left w:type="dxa" w:w="90"/>
+              <w:bottom w:type="dxa" w:w="60"/>
+              <w:right w:type="dxa" w:w="90"/>
+            </w:tcMar>
+          </w:tcPr>
+          <w:p>
+            <w:r>
+              <w:rPr>
+                <w:rFonts w:ascii="Calibri" w:cs="Calibri" w:eastAsia="Calibri" w:hAnsi="Calibri"/>
+                <w:b w:val="false"/>
+                <w:bCs w:val="false"/>
+                <w:color w:val="0F172A"/>
+                <w:sz w:val="19"/>
+                <w:szCs w:val="19"/>
+              </w:rPr>
+              <w:t xml:space="preserve">No patient names anywhere — patients are ID numbers only</w:t>
             </w:r>
           </w:p>
         </w:tc>
@@ -2618,7 +2723,7 @@
         </w:tc>
         <w:tc>
           <w:tcPr>
-            <w:tcW w:type="dxa" w:w="5320"/>
+            <w:tcW w:type="dxa" w:w="5020"/>
             <w:tcMar>
               <w:top w:type="dxa" w:w="60"/>
               <w:left w:type="dxa" w:w="90"/>
@@ -2636,7 +2741,7 @@
                 <w:sz w:val="19"/>
                 <w:szCs w:val="19"/>
               </w:rPr>
-              <w:t xml:space="preserve">No patient-name columns exist in the data; UI, filters, AI prompts and notifications use patient_id (de-identified aliases patient_&lt;id&gt;@notify.pharma).</w:t>
+              <w:t xml:space="preserve">The data holds no name columns at all; screens, filters and AI messages use IDs; any patient message goes to a masked address (patient_&lt;id&gt;@notify.pharma).</w:t>
             </w:r>
           </w:p>
         </w:tc>
@@ -2669,26 +2774,26 @@
         </w:tc>
         <w:tc>
           <w:tcPr>
-            <w:tcW w:type="dxa" w:w="3300"/>
-            <w:shd w:fill="EEF2FF" w:val="clear"/>
-            <w:tcMar>
-              <w:top w:type="dxa" w:w="60"/>
-              <w:left w:type="dxa" w:w="90"/>
-              <w:bottom w:type="dxa" w:w="60"/>
-              <w:right w:type="dxa" w:w="90"/>
-            </w:tcMar>
-          </w:tcPr>
-          <w:p>
-            <w:r>
-              <w:rPr>
-                <w:rFonts w:ascii="Calibri" w:cs="Calibri" w:eastAsia="Calibri" w:hAnsi="Calibri"/>
-                <w:b w:val="false"/>
-                <w:bCs w:val="false"/>
-                <w:color w:val="0F172A"/>
-                <w:sz w:val="19"/>
-                <w:szCs w:val="19"/>
-              </w:rPr>
-              <w:t xml:space="preserve">Agent SQL is read-only and bounded</w:t>
+            <w:tcW w:type="dxa" w:w="3600"/>
+            <w:shd w:fill="EEF2FF" w:val="clear"/>
+            <w:tcMar>
+              <w:top w:type="dxa" w:w="60"/>
+              <w:left w:type="dxa" w:w="90"/>
+              <w:bottom w:type="dxa" w:w="60"/>
+              <w:right w:type="dxa" w:w="90"/>
+            </w:tcMar>
+          </w:tcPr>
+          <w:p>
+            <w:r>
+              <w:rPr>
+                <w:rFonts w:ascii="Calibri" w:cs="Calibri" w:eastAsia="Calibri" w:hAnsi="Calibri"/>
+                <w:b w:val="false"/>
+                <w:bCs w:val="false"/>
+                <w:color w:val="0F172A"/>
+                <w:sz w:val="19"/>
+                <w:szCs w:val="19"/>
+              </w:rPr>
+              <w:t xml:space="preserve">The AI can only READ data — it can never change or delete it</w:t>
             </w:r>
           </w:p>
         </w:tc>
@@ -2722,7 +2827,7 @@
         </w:tc>
         <w:tc>
           <w:tcPr>
-            <w:tcW w:type="dxa" w:w="5320"/>
+            <w:tcW w:type="dxa" w:w="5020"/>
             <w:shd w:fill="EEF2FF" w:val="clear"/>
             <w:tcMar>
               <w:top w:type="dxa" w:w="60"/>
@@ -2741,7 +2846,7 @@
                 <w:sz w:val="19"/>
                 <w:szCs w:val="19"/>
               </w:rPr>
-              <w:t xml:space="preserve">agent.py::_run_readonly_sql — SELECT-only, write/DDL keyword blocklist, 200-row result cap.</w:t>
+              <w:t xml:space="preserve">The AI's database access allows read-only queries; any modifying command is blocked in code, and results are capped at 200 rows.</w:t>
             </w:r>
           </w:p>
         </w:tc>
@@ -2773,25 +2878,25 @@
         </w:tc>
         <w:tc>
           <w:tcPr>
-            <w:tcW w:type="dxa" w:w="3300"/>
-            <w:tcMar>
-              <w:top w:type="dxa" w:w="60"/>
-              <w:left w:type="dxa" w:w="90"/>
-              <w:bottom w:type="dxa" w:w="60"/>
-              <w:right w:type="dxa" w:w="90"/>
-            </w:tcMar>
-          </w:tcPr>
-          <w:p>
-            <w:r>
-              <w:rPr>
-                <w:rFonts w:ascii="Calibri" w:cs="Calibri" w:eastAsia="Calibri" w:hAnsi="Calibri"/>
-                <w:b w:val="false"/>
-                <w:bCs w:val="false"/>
-                <w:color w:val="0F172A"/>
-                <w:sz w:val="19"/>
-                <w:szCs w:val="19"/>
-              </w:rPr>
-              <w:t xml:space="preserve">App never writes to source clinical/claims tables</w:t>
+            <w:tcW w:type="dxa" w:w="3600"/>
+            <w:tcMar>
+              <w:top w:type="dxa" w:w="60"/>
+              <w:left w:type="dxa" w:w="90"/>
+              <w:bottom w:type="dxa" w:w="60"/>
+              <w:right w:type="dxa" w:w="90"/>
+            </w:tcMar>
+          </w:tcPr>
+          <w:p>
+            <w:r>
+              <w:rPr>
+                <w:rFonts w:ascii="Calibri" w:cs="Calibri" w:eastAsia="Calibri" w:hAnsi="Calibri"/>
+                <w:b w:val="false"/>
+                <w:bCs w:val="false"/>
+                <w:color w:val="0F172A"/>
+                <w:sz w:val="19"/>
+                <w:szCs w:val="19"/>
+              </w:rPr>
+              <w:t xml:space="preserve">The app never touches the original medical records</w:t>
             </w:r>
           </w:p>
         </w:tc>
@@ -2824,7 +2929,7 @@
         </w:tc>
         <w:tc>
           <w:tcPr>
-            <w:tcW w:type="dxa" w:w="5320"/>
+            <w:tcW w:type="dxa" w:w="5020"/>
             <w:tcMar>
               <w:top w:type="dxa" w:w="60"/>
               <w:left w:type="dxa" w:w="90"/>
@@ -2842,7 +2947,7 @@
                 <w:sz w:val="19"/>
                 <w:szCs w:val="19"/>
               </w:rPr>
-              <w:t xml:space="preserve">Writes restricted to the six Agent_* operational tables (db.py::ensure_agent_tables).</w:t>
+              <w:t xml:space="preserve">It writes only to its own six tracking tables (approvals, appointments, notifications, logs, chat history).</w:t>
             </w:r>
           </w:p>
         </w:tc>
@@ -2875,26 +2980,26 @@
         </w:tc>
         <w:tc>
           <w:tcPr>
-            <w:tcW w:type="dxa" w:w="3300"/>
-            <w:shd w:fill="EEF2FF" w:val="clear"/>
-            <w:tcMar>
-              <w:top w:type="dxa" w:w="60"/>
-              <w:left w:type="dxa" w:w="90"/>
-              <w:bottom w:type="dxa" w:w="60"/>
-              <w:right w:type="dxa" w:w="90"/>
-            </w:tcMar>
-          </w:tcPr>
-          <w:p>
-            <w:r>
-              <w:rPr>
-                <w:rFonts w:ascii="Calibri" w:cs="Calibri" w:eastAsia="Calibri" w:hAnsi="Calibri"/>
-                <w:b w:val="false"/>
-                <w:bCs w:val="false"/>
-                <w:color w:val="0F172A"/>
-                <w:sz w:val="19"/>
-                <w:szCs w:val="19"/>
-              </w:rPr>
-              <w:t xml:space="preserve">No secrets in the repository</w:t>
+            <w:tcW w:type="dxa" w:w="3600"/>
+            <w:shd w:fill="EEF2FF" w:val="clear"/>
+            <w:tcMar>
+              <w:top w:type="dxa" w:w="60"/>
+              <w:left w:type="dxa" w:w="90"/>
+              <w:bottom w:type="dxa" w:w="60"/>
+              <w:right w:type="dxa" w:w="90"/>
+            </w:tcMar>
+          </w:tcPr>
+          <w:p>
+            <w:r>
+              <w:rPr>
+                <w:rFonts w:ascii="Calibri" w:cs="Calibri" w:eastAsia="Calibri" w:hAnsi="Calibri"/>
+                <w:b w:val="false"/>
+                <w:bCs w:val="false"/>
+                <w:color w:val="0F172A"/>
+                <w:sz w:val="19"/>
+                <w:szCs w:val="19"/>
+              </w:rPr>
+              <w:t xml:space="preserve">No passwords or keys in the shared code</w:t>
             </w:r>
           </w:p>
         </w:tc>
@@ -2928,7 +3033,7 @@
         </w:tc>
         <w:tc>
           <w:tcPr>
-            <w:tcW w:type="dxa" w:w="5320"/>
+            <w:tcW w:type="dxa" w:w="5020"/>
             <w:shd w:fill="EEF2FF" w:val="clear"/>
             <w:tcMar>
               <w:top w:type="dxa" w:w="60"/>
@@ -2947,7 +3052,7 @@
                 <w:sz w:val="19"/>
                 <w:szCs w:val="19"/>
               </w:rPr>
-              <w:t xml:space="preserve">.env (API key, DB credentials) is in .gitignore; verified absent from the GitHub repo; config.py loads everything from environment.</w:t>
+              <w:t xml:space="preserve">All secrets live in a local .env file that is excluded from GitHub — verified absent from the repository.</w:t>
             </w:r>
           </w:p>
         </w:tc>
@@ -2967,7 +3072,7 @@
           <w:sz w:val="25"/>
           <w:szCs w:val="25"/>
         </w:rPr>
-        <w:t xml:space="preserve">6. Usability &amp; Dashboarding</w:t>
+        <w:t xml:space="preserve">6. Easy to use — works like a real dashboard</w:t>
       </w:r>
     </w:p>
     <w:tbl>
@@ -2984,9 +3089,9 @@
       </w:tblPr>
       <w:tblGrid>
         <w:gridCol w:w="560"/>
-        <w:gridCol w:w="3300"/>
+        <w:gridCol w:w="3600"/>
         <w:gridCol w:w="900"/>
-        <w:gridCol w:w="5320"/>
+        <w:gridCol w:w="5020"/>
       </w:tblGrid>
       <w:tr>
         <w:trPr>
@@ -3019,7 +3124,7 @@
         </w:tc>
         <w:tc>
           <w:tcPr>
-            <w:tcW w:type="dxa" w:w="3300"/>
+            <w:tcW w:type="dxa" w:w="3600"/>
             <w:shd w:fill="1E3A5F" w:val="clear"/>
             <w:tcMar>
               <w:top w:type="dxa" w:w="60"/>
@@ -3038,7 +3143,7 @@
                 <w:sz w:val="19"/>
                 <w:szCs w:val="19"/>
               </w:rPr>
-              <w:t xml:space="preserve">Criterion (Definition of Done)</w:t>
+              <w:t xml:space="preserve">What was required (Definition of Done)</w:t>
             </w:r>
           </w:p>
         </w:tc>
@@ -3072,7 +3177,7 @@
         </w:tc>
         <w:tc>
           <w:tcPr>
-            <w:tcW w:type="dxa" w:w="5320"/>
+            <w:tcW w:type="dxa" w:w="5020"/>
             <w:shd w:fill="1E3A5F" w:val="clear"/>
             <w:tcMar>
               <w:top w:type="dxa" w:w="60"/>
@@ -3091,7 +3196,7 @@
                 <w:sz w:val="19"/>
                 <w:szCs w:val="19"/>
               </w:rPr>
-              <w:t xml:space="preserve">Evidence — where / how to verify</w:t>
+              <w:t xml:space="preserve">Proof — where a reviewer can see it</w:t>
             </w:r>
           </w:p>
         </w:tc>
@@ -3123,25 +3228,25 @@
         </w:tc>
         <w:tc>
           <w:tcPr>
-            <w:tcW w:type="dxa" w:w="3300"/>
-            <w:tcMar>
-              <w:top w:type="dxa" w:w="60"/>
-              <w:left w:type="dxa" w:w="90"/>
-              <w:bottom w:type="dxa" w:w="60"/>
-              <w:right w:type="dxa" w:w="90"/>
-            </w:tcMar>
-          </w:tcPr>
-          <w:p>
-            <w:r>
-              <w:rPr>
-                <w:rFonts w:ascii="Calibri" w:cs="Calibri" w:eastAsia="Calibri" w:hAnsi="Calibri"/>
-                <w:b w:val="false"/>
-                <w:bCs w:val="false"/>
-                <w:color w:val="0F172A"/>
-                <w:sz w:val="19"/>
-                <w:szCs w:val="19"/>
-              </w:rPr>
-              <w:t xml:space="preserve">Interactive dashboards: date slicers + click cross-filtering per section</w:t>
+            <w:tcW w:type="dxa" w:w="3600"/>
+            <w:tcMar>
+              <w:top w:type="dxa" w:w="60"/>
+              <w:left w:type="dxa" w:w="90"/>
+              <w:bottom w:type="dxa" w:w="60"/>
+              <w:right w:type="dxa" w:w="90"/>
+            </w:tcMar>
+          </w:tcPr>
+          <w:p>
+            <w:r>
+              <w:rPr>
+                <w:rFonts w:ascii="Calibri" w:cs="Calibri" w:eastAsia="Calibri" w:hAnsi="Calibri"/>
+                <w:b w:val="false"/>
+                <w:bCs w:val="false"/>
+                <w:color w:val="0F172A"/>
+                <w:sz w:val="19"/>
+                <w:szCs w:val="19"/>
+              </w:rPr>
+              <w:t xml:space="preserve">Filter a whole section by date, like Power BI</w:t>
             </w:r>
           </w:p>
         </w:tc>
@@ -3174,7 +3279,7 @@
         </w:tc>
         <w:tc>
           <w:tcPr>
-            <w:tcW w:type="dxa" w:w="5320"/>
+            <w:tcW w:type="dxa" w:w="5020"/>
             <w:tcMar>
               <w:top w:type="dxa" w:w="60"/>
               <w:left w:type="dxa" w:w="90"/>
@@ -3192,7 +3297,7 @@
                 <w:sz w:val="19"/>
                 <w:szCs w:val="19"/>
               </w:rPr>
-              <w:t xml:space="preserve">Every data page has a month-granular date slicer; clicking a bar or a map state cross-filters all charts in that section (highlight + “✖ Clear” chip).</w:t>
+              <w:t xml:space="preserve">A date slider at the top of every section — drag it and every chart, table and number on the page updates together.</w:t>
             </w:r>
           </w:p>
         </w:tc>
@@ -3225,26 +3330,26 @@
         </w:tc>
         <w:tc>
           <w:tcPr>
-            <w:tcW w:type="dxa" w:w="3300"/>
-            <w:shd w:fill="EEF2FF" w:val="clear"/>
-            <w:tcMar>
-              <w:top w:type="dxa" w:w="60"/>
-              <w:left w:type="dxa" w:w="90"/>
-              <w:bottom w:type="dxa" w:w="60"/>
-              <w:right w:type="dxa" w:w="90"/>
-            </w:tcMar>
-          </w:tcPr>
-          <w:p>
-            <w:r>
-              <w:rPr>
-                <w:rFonts w:ascii="Calibri" w:cs="Calibri" w:eastAsia="Calibri" w:hAnsi="Calibri"/>
-                <w:b w:val="false"/>
-                <w:bCs w:val="false"/>
-                <w:color w:val="0F172A"/>
-                <w:sz w:val="19"/>
-                <w:szCs w:val="19"/>
-              </w:rPr>
-              <w:t xml:space="preserve">Layman-readable visuals</w:t>
+            <w:tcW w:type="dxa" w:w="3600"/>
+            <w:shd w:fill="EEF2FF" w:val="clear"/>
+            <w:tcMar>
+              <w:top w:type="dxa" w:w="60"/>
+              <w:left w:type="dxa" w:w="90"/>
+              <w:bottom w:type="dxa" w:w="60"/>
+              <w:right w:type="dxa" w:w="90"/>
+            </w:tcMar>
+          </w:tcPr>
+          <w:p>
+            <w:r>
+              <w:rPr>
+                <w:rFonts w:ascii="Calibri" w:cs="Calibri" w:eastAsia="Calibri" w:hAnsi="Calibri"/>
+                <w:b w:val="false"/>
+                <w:bCs w:val="false"/>
+                <w:color w:val="0F172A"/>
+                <w:sz w:val="19"/>
+                <w:szCs w:val="19"/>
+              </w:rPr>
+              <w:t xml:space="preserve">Click any chart to filter every other chart in that section</w:t>
             </w:r>
           </w:p>
         </w:tc>
@@ -3278,7 +3383,7 @@
         </w:tc>
         <w:tc>
           <w:tcPr>
-            <w:tcW w:type="dxa" w:w="5320"/>
+            <w:tcW w:type="dxa" w:w="5020"/>
             <w:shd w:fill="EEF2FF" w:val="clear"/>
             <w:tcMar>
               <w:top w:type="dxa" w:w="60"/>
@@ -3297,7 +3402,7 @@
                 <w:sz w:val="19"/>
                 <w:szCs w:val="19"/>
               </w:rPr>
-              <w:t xml:space="preserve">Plain-English caption under every chart; data labels on every bar; all numbers ≥ 4 digits comma-separated; no red colour palette in charts.</w:t>
+              <w:t xml:space="preserve">Click a bar (or a state on a map): it stays highlighted, the rest of the page follows, and a ✖ Clear button resets.</w:t>
             </w:r>
           </w:p>
         </w:tc>
@@ -3329,25 +3434,25 @@
         </w:tc>
         <w:tc>
           <w:tcPr>
-            <w:tcW w:type="dxa" w:w="3300"/>
-            <w:tcMar>
-              <w:top w:type="dxa" w:w="60"/>
-              <w:left w:type="dxa" w:w="90"/>
-              <w:bottom w:type="dxa" w:w="60"/>
-              <w:right w:type="dxa" w:w="90"/>
-            </w:tcMar>
-          </w:tcPr>
-          <w:p>
-            <w:r>
-              <w:rPr>
-                <w:rFonts w:ascii="Calibri" w:cs="Calibri" w:eastAsia="Calibri" w:hAnsi="Calibri"/>
-                <w:b w:val="false"/>
-                <w:bCs w:val="false"/>
-                <w:color w:val="0F172A"/>
-                <w:sz w:val="19"/>
-                <w:szCs w:val="19"/>
-              </w:rPr>
-              <w:t xml:space="preserve">Geographic visualisation</w:t>
+            <w:tcW w:type="dxa" w:w="3600"/>
+            <w:tcMar>
+              <w:top w:type="dxa" w:w="60"/>
+              <w:left w:type="dxa" w:w="90"/>
+              <w:bottom w:type="dxa" w:w="60"/>
+              <w:right w:type="dxa" w:w="90"/>
+            </w:tcMar>
+          </w:tcPr>
+          <w:p>
+            <w:r>
+              <w:rPr>
+                <w:rFonts w:ascii="Calibri" w:cs="Calibri" w:eastAsia="Calibri" w:hAnsi="Calibri"/>
+                <w:b w:val="false"/>
+                <w:bCs w:val="false"/>
+                <w:color w:val="0F172A"/>
+                <w:sz w:val="19"/>
+                <w:szCs w:val="19"/>
+              </w:rPr>
+              <w:t xml:space="preserve">Everything is labelled for a business reader</w:t>
             </w:r>
           </w:p>
         </w:tc>
@@ -3380,7 +3485,7 @@
         </w:tc>
         <w:tc>
           <w:tcPr>
-            <w:tcW w:type="dxa" w:w="5320"/>
+            <w:tcW w:type="dxa" w:w="5020"/>
             <w:tcMar>
               <w:top w:type="dxa" w:w="60"/>
               <w:left w:type="dxa" w:w="90"/>
@@ -3398,7 +3503,7 @@
                 <w:sz w:val="19"/>
                 <w:szCs w:val="19"/>
               </w:rPr>
-              <w:t xml:space="preserve">Two US choropleth heatmaps (sales by state, marketing spend by state) on Physician &amp; Geo Intelligence, clickable for cross-filter.</w:t>
+              <w:t xml:space="preserve">Every chart has a plain-English caption; every KPI card shows a one-line description on hover; all large numbers are comma-formatted with values printed on the bars.</w:t>
             </w:r>
           </w:p>
         </w:tc>
@@ -3431,26 +3536,26 @@
         </w:tc>
         <w:tc>
           <w:tcPr>
-            <w:tcW w:type="dxa" w:w="3300"/>
-            <w:shd w:fill="EEF2FF" w:val="clear"/>
-            <w:tcMar>
-              <w:top w:type="dxa" w:w="60"/>
-              <w:left w:type="dxa" w:w="90"/>
-              <w:bottom w:type="dxa" w:w="60"/>
-              <w:right w:type="dxa" w:w="90"/>
-            </w:tcMar>
-          </w:tcPr>
-          <w:p>
-            <w:r>
-              <w:rPr>
-                <w:rFonts w:ascii="Calibri" w:cs="Calibri" w:eastAsia="Calibri" w:hAnsi="Calibri"/>
-                <w:b w:val="false"/>
-                <w:bCs w:val="false"/>
-                <w:color w:val="0F172A"/>
-                <w:sz w:val="19"/>
-                <w:szCs w:val="19"/>
-              </w:rPr>
-              <w:t xml:space="preserve">Commercial intelligence — manufacturer loyalty</w:t>
+            <w:tcW w:type="dxa" w:w="3600"/>
+            <w:shd w:fill="EEF2FF" w:val="clear"/>
+            <w:tcMar>
+              <w:top w:type="dxa" w:w="60"/>
+              <w:left w:type="dxa" w:w="90"/>
+              <w:bottom w:type="dxa" w:w="60"/>
+              <w:right w:type="dxa" w:w="90"/>
+            </w:tcMar>
+          </w:tcPr>
+          <w:p>
+            <w:r>
+              <w:rPr>
+                <w:rFonts w:ascii="Calibri" w:cs="Calibri" w:eastAsia="Calibri" w:hAnsi="Calibri"/>
+                <w:b w:val="false"/>
+                <w:bCs w:val="false"/>
+                <w:color w:val="0F172A"/>
+                <w:sz w:val="19"/>
+                <w:szCs w:val="19"/>
+              </w:rPr>
+              <w:t xml:space="preserve">Show where the business is on the map, and who the key doctors are</w:t>
             </w:r>
           </w:p>
         </w:tc>
@@ -3484,7 +3589,7 @@
         </w:tc>
         <w:tc>
           <w:tcPr>
-            <w:tcW w:type="dxa" w:w="5320"/>
+            <w:tcW w:type="dxa" w:w="5020"/>
             <w:shd w:fill="EEF2FF" w:val="clear"/>
             <w:tcMar>
               <w:top w:type="dxa" w:w="60"/>
@@ -3503,7 +3608,7 @@
                 <w:sz w:val="19"/>
                 <w:szCs w:val="19"/>
               </w:rPr>
-              <w:t xml:space="preserve">“Top doctors — whose medicines do they prescribe?” stacked chart (EISAI vs competitors vs OTHERS) + per-doctor “EISAI share” metric and mix chart in the Doctor Profile.</w:t>
+              <w:t xml:space="preserve">Two USA maps (sales per state vs marketing spend per state) reveal over-spent and under-sold states; the “Top doctors” chart shows whose medicines each doctor prescribes — blue = our company (EISAI) — pointing the sales team to the right doors.</w:t>
             </w:r>
           </w:p>
         </w:tc>
@@ -3523,7 +3628,7 @@
           <w:sz w:val="25"/>
           <w:szCs w:val="25"/>
         </w:rPr>
-        <w:t xml:space="preserve">7. Engineering &amp; Delivery</w:t>
+        <w:t xml:space="preserve">7. Delivery — complete and reproducible</w:t>
       </w:r>
     </w:p>
     <w:tbl>
@@ -3540,9 +3645,9 @@
       </w:tblPr>
       <w:tblGrid>
         <w:gridCol w:w="560"/>
-        <w:gridCol w:w="3300"/>
+        <w:gridCol w:w="3600"/>
         <w:gridCol w:w="900"/>
-        <w:gridCol w:w="5320"/>
+        <w:gridCol w:w="5020"/>
       </w:tblGrid>
       <w:tr>
         <w:trPr>
@@ -3575,7 +3680,7 @@
         </w:tc>
         <w:tc>
           <w:tcPr>
-            <w:tcW w:type="dxa" w:w="3300"/>
+            <w:tcW w:type="dxa" w:w="3600"/>
             <w:shd w:fill="1E3A5F" w:val="clear"/>
             <w:tcMar>
               <w:top w:type="dxa" w:w="60"/>
@@ -3594,7 +3699,7 @@
                 <w:sz w:val="19"/>
                 <w:szCs w:val="19"/>
               </w:rPr>
-              <w:t xml:space="preserve">Criterion (Definition of Done)</w:t>
+              <w:t xml:space="preserve">What was required (Definition of Done)</w:t>
             </w:r>
           </w:p>
         </w:tc>
@@ -3628,7 +3733,7 @@
         </w:tc>
         <w:tc>
           <w:tcPr>
-            <w:tcW w:type="dxa" w:w="5320"/>
+            <w:tcW w:type="dxa" w:w="5020"/>
             <w:shd w:fill="1E3A5F" w:val="clear"/>
             <w:tcMar>
               <w:top w:type="dxa" w:w="60"/>
@@ -3647,7 +3752,7 @@
                 <w:sz w:val="19"/>
                 <w:szCs w:val="19"/>
               </w:rPr>
-              <w:t xml:space="preserve">Evidence — where / how to verify</w:t>
+              <w:t xml:space="preserve">Proof — where a reviewer can see it</w:t>
             </w:r>
           </w:p>
         </w:tc>
@@ -3679,25 +3784,25 @@
         </w:tc>
         <w:tc>
           <w:tcPr>
-            <w:tcW w:type="dxa" w:w="3300"/>
-            <w:tcMar>
-              <w:top w:type="dxa" w:w="60"/>
-              <w:left w:type="dxa" w:w="90"/>
-              <w:bottom w:type="dxa" w:w="60"/>
-              <w:right w:type="dxa" w:w="90"/>
-            </w:tcMar>
-          </w:tcPr>
-          <w:p>
-            <w:r>
-              <w:rPr>
-                <w:rFonts w:ascii="Calibri" w:cs="Calibri" w:eastAsia="Calibri" w:hAnsi="Calibri"/>
-                <w:b w:val="false"/>
-                <w:bCs w:val="false"/>
-                <w:color w:val="0F172A"/>
-                <w:sz w:val="19"/>
-                <w:szCs w:val="19"/>
-              </w:rPr>
-              <w:t xml:space="preserve">Code, tools, agent files and prompts in a shared repository</w:t>
+            <w:tcW w:type="dxa" w:w="3600"/>
+            <w:tcMar>
+              <w:top w:type="dxa" w:w="60"/>
+              <w:left w:type="dxa" w:w="90"/>
+              <w:bottom w:type="dxa" w:w="60"/>
+              <w:right w:type="dxa" w:w="90"/>
+            </w:tcMar>
+          </w:tcPr>
+          <w:p>
+            <w:r>
+              <w:rPr>
+                <w:rFonts w:ascii="Calibri" w:cs="Calibri" w:eastAsia="Calibri" w:hAnsi="Calibri"/>
+                <w:b w:val="false"/>
+                <w:bCs w:val="false"/>
+                <w:color w:val="0F172A"/>
+                <w:sz w:val="19"/>
+                <w:szCs w:val="19"/>
+              </w:rPr>
+              <w:t xml:space="preserve">Everything needed is in one shared GitHub repository</w:t>
             </w:r>
           </w:p>
         </w:tc>
@@ -3730,7 +3835,7 @@
         </w:tc>
         <w:tc>
           <w:tcPr>
-            <w:tcW w:type="dxa" w:w="5320"/>
+            <w:tcW w:type="dxa" w:w="5020"/>
             <w:tcMar>
               <w:top w:type="dxa" w:w="60"/>
               <w:left w:type="dxa" w:w="90"/>
@@ -3748,7 +3853,7 @@
                 <w:sz w:val="19"/>
                 <w:szCs w:val="19"/>
               </w:rPr>
-              <w:t xml:space="preserve">GitHub: CT-Hackcelerate/SIGMA---Seizure-Intelligence-Growth-Management-Agent (main branch) — all source, tool schemas, agent prompts, README, PROJECT_DOCUMENTATION.txt.</w:t>
+              <w:t xml:space="preserve">Code, the AI's instructions (prompts), configuration, README, full project documentation, and this docs folder — repository main branch.</w:t>
             </w:r>
           </w:p>
         </w:tc>
@@ -3781,26 +3886,26 @@
         </w:tc>
         <w:tc>
           <w:tcPr>
-            <w:tcW w:type="dxa" w:w="3300"/>
-            <w:shd w:fill="EEF2FF" w:val="clear"/>
-            <w:tcMar>
-              <w:top w:type="dxa" w:w="60"/>
-              <w:left w:type="dxa" w:w="90"/>
-              <w:bottom w:type="dxa" w:w="60"/>
-              <w:right w:type="dxa" w:w="90"/>
-            </w:tcMar>
-          </w:tcPr>
-          <w:p>
-            <w:r>
-              <w:rPr>
-                <w:rFonts w:ascii="Calibri" w:cs="Calibri" w:eastAsia="Calibri" w:hAnsi="Calibri"/>
-                <w:b w:val="false"/>
-                <w:bCs w:val="false"/>
-                <w:color w:val="0F172A"/>
-                <w:sz w:val="19"/>
-                <w:szCs w:val="19"/>
-              </w:rPr>
-              <w:t xml:space="preserve">Reproducible setup: prerequisites, commands, inputs/outputs, troubleshooting</w:t>
+            <w:tcW w:type="dxa" w:w="3600"/>
+            <w:shd w:fill="EEF2FF" w:val="clear"/>
+            <w:tcMar>
+              <w:top w:type="dxa" w:w="60"/>
+              <w:left w:type="dxa" w:w="90"/>
+              <w:bottom w:type="dxa" w:w="60"/>
+              <w:right w:type="dxa" w:w="90"/>
+            </w:tcMar>
+          </w:tcPr>
+          <w:p>
+            <w:r>
+              <w:rPr>
+                <w:rFonts w:ascii="Calibri" w:cs="Calibri" w:eastAsia="Calibri" w:hAnsi="Calibri"/>
+                <w:b w:val="false"/>
+                <w:bCs w:val="false"/>
+                <w:color w:val="0F172A"/>
+                <w:sz w:val="19"/>
+                <w:szCs w:val="19"/>
+              </w:rPr>
+              <w:t xml:space="preserve">A newcomer can set SIGMA up from scratch using only the README</w:t>
             </w:r>
           </w:p>
         </w:tc>
@@ -3834,7 +3939,7 @@
         </w:tc>
         <w:tc>
           <w:tcPr>
-            <w:tcW w:type="dxa" w:w="5320"/>
+            <w:tcW w:type="dxa" w:w="5020"/>
             <w:shd w:fill="EEF2FF" w:val="clear"/>
             <w:tcMar>
               <w:top w:type="dxa" w:w="60"/>
@@ -3853,7 +3958,7 @@
                 <w:sz w:val="19"/>
                 <w:szCs w:val="19"/>
               </w:rPr>
-              <w:t xml:space="preserve">README.md §1–§3 (setup &amp; commands), §5 (inputs/outputs), §8 (troubleshooting table); test_connection.py pre-flight script.</w:t>
+              <w:t xml:space="preserve">Step-by-step setup in simple language: create the settings file (.env) from a template, three database setup options, a connection checker to run first, and a troubleshooting table.</w:t>
             </w:r>
           </w:p>
         </w:tc>
@@ -3885,25 +3990,25 @@
         </w:tc>
         <w:tc>
           <w:tcPr>
-            <w:tcW w:type="dxa" w:w="3300"/>
-            <w:tcMar>
-              <w:top w:type="dxa" w:w="60"/>
-              <w:left w:type="dxa" w:w="90"/>
-              <w:bottom w:type="dxa" w:w="60"/>
-              <w:right w:type="dxa" w:w="90"/>
-            </w:tcMar>
-          </w:tcPr>
-          <w:p>
-            <w:r>
-              <w:rPr>
-                <w:rFonts w:ascii="Calibri" w:cs="Calibri" w:eastAsia="Calibri" w:hAnsi="Calibri"/>
-                <w:b w:val="false"/>
-                <w:bCs w:val="false"/>
-                <w:color w:val="0F172A"/>
-                <w:sz w:val="19"/>
-                <w:szCs w:val="19"/>
-              </w:rPr>
-              <w:t xml:space="preserve">Limitations stated honestly</w:t>
+            <w:tcW w:type="dxa" w:w="3600"/>
+            <w:tcMar>
+              <w:top w:type="dxa" w:w="60"/>
+              <w:left w:type="dxa" w:w="90"/>
+              <w:bottom w:type="dxa" w:w="60"/>
+              <w:right w:type="dxa" w:w="90"/>
+            </w:tcMar>
+          </w:tcPr>
+          <w:p>
+            <w:r>
+              <w:rPr>
+                <w:rFonts w:ascii="Calibri" w:cs="Calibri" w:eastAsia="Calibri" w:hAnsi="Calibri"/>
+                <w:b w:val="false"/>
+                <w:bCs w:val="false"/>
+                <w:color w:val="0F172A"/>
+                <w:sz w:val="19"/>
+                <w:szCs w:val="19"/>
+              </w:rPr>
+              <w:t xml:space="preserve">Limitations are stated openly</w:t>
             </w:r>
           </w:p>
         </w:tc>
@@ -3936,7 +4041,7 @@
         </w:tc>
         <w:tc>
           <w:tcPr>
-            <w:tcW w:type="dxa" w:w="5320"/>
+            <w:tcW w:type="dxa" w:w="5020"/>
             <w:tcMar>
               <w:top w:type="dxa" w:w="60"/>
               <w:left w:type="dxa" w:w="90"/>
@@ -3954,7 +4059,7 @@
                 <w:sz w:val="19"/>
                 <w:szCs w:val="19"/>
               </w:rPr>
-              <w:t xml:space="preserve">README.md §7 — SSMS-only, API credits required, data ends 2025, simulated e-mail without SMTP, session-scoped insights, 12-turn agent cap.</w:t>
+              <w:t xml:space="preserve">README lists them: needs a reachable database, AI features need an API key, e-mails are simulated unless configured, and more.</w:t>
             </w:r>
           </w:p>
         </w:tc>
@@ -3974,7 +4079,7 @@
           <w:sz w:val="25"/>
           <w:szCs w:val="25"/>
         </w:rPr>
-        <w:t xml:space="preserve">Known Gaps (declared transparently)</w:t>
+        <w:t xml:space="preserve">Declared gaps (what is intentionally not in scope yet)</w:t>
       </w:r>
     </w:p>
     <w:p>
@@ -3988,7 +4093,7 @@
           <w:sz w:val="21"/>
           <w:szCs w:val="21"/>
         </w:rPr>
-        <w:t xml:space="preserve">• No automated unit-test suite (verification is via test_connection.py, live smoke tests and manual demo scripts).</w:t>
+        <w:t xml:space="preserve">–  No automated test suite — verification is via the connection checker, live data checks and demo scripts.</w:t>
       </w:r>
     </w:p>
     <w:p>
@@ -4002,7 +4107,7 @@
           <w:sz w:val="21"/>
           <w:szCs w:val="21"/>
         </w:rPr>
-        <w:t xml:space="preserve">• E-mail delivery is simulated unless SMTP credentials are configured in .env.</w:t>
+        <w:t xml:space="preserve">–  E-mails are simulated unless mail settings are configured (records are still stored).</w:t>
       </w:r>
     </w:p>
     <w:p>
@@ -4016,7 +4121,7 @@
           <w:sz w:val="21"/>
           <w:szCs w:val="21"/>
         </w:rPr>
-        <w:t xml:space="preserve">• AI insight cards are session-scoped (approved/queued actions persist in the database).</w:t>
+        <w:t xml:space="preserve">–  AI summaries reset when the browser page reloads (approved actions are permanently saved).</w:t>
       </w:r>
     </w:p>
     <w:p>
@@ -4030,7 +4135,7 @@
           <w:sz w:val="21"/>
           <w:szCs w:val="21"/>
         </w:rPr>
-        <w:t xml:space="preserve">• No role-based access control yet — single-operator approval model (roadmap item 9.14).</w:t>
+        <w:t xml:space="preserve">–  One shared approver role today — separate roles per team is on the roadmap.</w:t>
       </w:r>
     </w:p>
     <w:p>
@@ -4049,7 +4154,7 @@
           <w:sz w:val="17"/>
           <w:szCs w:val="17"/>
         </w:rPr>
-        <w:t xml:space="preserve">Prepared for CT-Hackcelerate DoD review · SIGMA — Seizure Intelligence &amp; Growth Management Agent · All evidence verifiable in the repository and the live application.</w:t>
+        <w:t xml:space="preserve">Prepared for the CT-Hackcelerate review · SIGMA · every item above can be verified in the GitHub repository or live in the application.</w:t>
       </w:r>
     </w:p>
     <w:sectPr>

</xml_diff>